<commit_message>
eda: cleaner dataset-overview figure (short labels, counts on bars, no redundant axes)
Panel (b) reasoning labels shortened (Numerical/Unlabeled/Info. extraction/Logical
(num.)) with counts at bar ends; bar panels annotate counts and drop the repeated
'# questions' y-axes; fixes the wasted horizontal space. Refreshed paper/main.docx.
</commit_message>
<xml_diff>
--- a/paper/main.docx
+++ b/paper/main.docx
@@ -1967,7 +1967,7 @@
       <w:r>
         <w:drawing>
           <wp:inline>
-            <wp:extent cx="5753100" cy="4618358"/>
+            <wp:extent cx="5753100" cy="4094119"/>
             <wp:effectExtent b="0" l="0" r="0" t="0"/>
             <wp:docPr descr="FinanceBench (open-source, n=150) overview: (a) balanced question types, (b) numeric reasoning dominates, (c) 10-K filings dominate the corpus, (d) gold answers are short." title="" id="1" name="Picture"/>
             <a:graphic>
@@ -1988,7 +1988,7 @@
                   <pic:spPr bwMode="auto">
                     <a:xfrm>
                       <a:off x="0" y="0"/>
-                      <a:ext cx="5753100" cy="4618358"/>
+                      <a:ext cx="5753100" cy="4094119"/>
                     </a:xfrm>
                     <a:prstGeom prst="rect">
                       <a:avLst/>

</xml_diff>

<commit_message>
eda: wrap panel (b) reasoning labels onto two lines to reclaim horizontal space
</commit_message>
<xml_diff>
--- a/paper/main.docx
+++ b/paper/main.docx
@@ -1967,7 +1967,7 @@
       <w:r>
         <w:drawing>
           <wp:inline>
-            <wp:extent cx="5753100" cy="4094119"/>
+            <wp:extent cx="5753100" cy="4115222"/>
             <wp:effectExtent b="0" l="0" r="0" t="0"/>
             <wp:docPr descr="FinanceBench (open-source, n=150) overview: (a) balanced question types, (b) numeric reasoning dominates, (c) 10-K filings dominate the corpus, (d) gold answers are short." title="" id="1" name="Picture"/>
             <a:graphic>
@@ -1988,7 +1988,7 @@
                   <pic:spPr bwMode="auto">
                     <a:xfrm>
                       <a:off x="0" y="0"/>
-                      <a:ext cx="5753100" cy="4094119"/>
+                      <a:ext cx="5753100" cy="4115222"/>
                     </a:xfrm>
                     <a:prstGeom prst="rect">
                       <a:avLst/>

</xml_diff>

<commit_message>
eda notebook: update Figure-1 cell to the clean/wrapped overview + re-execute
Section 11 overview cell now holds the polished design (short/wrapped labels,
counts on bars, no redundant y-axes) and its stored output matches; standalone
reasoning figure also wrapped. Re-running the notebook now reproduces the clean
figure instead of reverting. Synced paper/ + regenerated main.docx.
</commit_message>
<xml_diff>
--- a/paper/main.docx
+++ b/paper/main.docx
@@ -1967,7 +1967,7 @@
       <w:r>
         <w:drawing>
           <wp:inline>
-            <wp:extent cx="5753100" cy="4115222"/>
+            <wp:extent cx="5753100" cy="4122750"/>
             <wp:effectExtent b="0" l="0" r="0" t="0"/>
             <wp:docPr descr="FinanceBench (open-source, n=150) overview: (a) balanced question types, (b) numeric reasoning dominates, (c) 10-K filings dominate the corpus, (d) gold answers are short." title="" id="1" name="Picture"/>
             <a:graphic>
@@ -1988,7 +1988,7 @@
                   <pic:spPr bwMode="auto">
                     <a:xfrm>
                       <a:off x="0" y="0"/>
-                      <a:ext cx="5753100" cy="4115222"/>
+                      <a:ext cx="5753100" cy="4122750"/>
                     </a:xfrm>
                     <a:prstGeom prst="rect">
                       <a:avLst/>

</xml_diff>

<commit_message>
Add numeric-tolerant EM (format-agnostic value match) + surface it in the report
Strict SQuAD EM was ~0 because financial gold answers are formatted many ways
($1,577 / 1577.00 / 1.577 billion). Added numeric_match + exact_match_numeric in
qa_metrics.py: matches the gold value within 1%, ignoring format; reported ALONGSIDE
strict EM/F1 (not replacing).

Measured (all 150): strict EM ~0 -> numeric-tolerant EM 0.12 / 0.18 / 0.21 / 0.27
(baseline/dense/enhanced/single-doc); 33-42% of *answered* questions are actually
correct. Rises with retrieval, consistent with RQ1. Added as an "EM (num)" column in
the comparison table + a sentence in the paper (main.tex/main.md, docx regenerated).

Conclusion: strict EM understated correctness; the model was penalized for formatting,
not errors. (Structure-aware table extraction remains future work.)
</commit_message>
<xml_diff>
--- a/paper/main.docx
+++ b/paper/main.docx
@@ -2497,6 +2497,17 @@
             </w:r>
           </w:p>
         </w:tc>
+        <w:tc>
+          <w:p>
+            <w:pPr>
+              <w:pStyle w:val="Compact"/>
+              <w:jc w:val="left"/>
+            </w:pPr>
+            <w:r>
+              <w:t xml:space="preserve">EM (num)</w:t>
+            </w:r>
+          </w:p>
+        </w:tc>
       </w:tr>
       <w:tr>
         <w:tc>
@@ -2573,6 +2584,17 @@
             </w:pPr>
             <w:r>
               <w:t xml:space="preserve">0.083</w:t>
+            </w:r>
+          </w:p>
+        </w:tc>
+        <w:tc>
+          <w:p>
+            <w:pPr>
+              <w:pStyle w:val="Compact"/>
+              <w:jc w:val="left"/>
+            </w:pPr>
+            <w:r>
+              <w:t xml:space="preserve">0.120</w:t>
             </w:r>
           </w:p>
         </w:tc>
@@ -2655,6 +2677,17 @@
             </w:r>
           </w:p>
         </w:tc>
+        <w:tc>
+          <w:p>
+            <w:pPr>
+              <w:pStyle w:val="Compact"/>
+              <w:jc w:val="left"/>
+            </w:pPr>
+            <w:r>
+              <w:t xml:space="preserve">0.180</w:t>
+            </w:r>
+          </w:p>
+        </w:tc>
       </w:tr>
       <w:tr>
         <w:tc>
@@ -2731,6 +2764,17 @@
             </w:pPr>
             <w:r>
               <w:t xml:space="preserve">0.121</w:t>
+            </w:r>
+          </w:p>
+        </w:tc>
+        <w:tc>
+          <w:p>
+            <w:pPr>
+              <w:pStyle w:val="Compact"/>
+              <w:jc w:val="left"/>
+            </w:pPr>
+            <w:r>
+              <w:t xml:space="preserve">0.207</w:t>
             </w:r>
           </w:p>
         </w:tc>
@@ -2813,6 +2857,17 @@
             </w:r>
           </w:p>
         </w:tc>
+        <w:tc>
+          <w:p>
+            <w:pPr>
+              <w:pStyle w:val="Compact"/>
+              <w:jc w:val="left"/>
+            </w:pPr>
+            <w:r>
+              <w:t xml:space="preserve">0.267</w:t>
+            </w:r>
+          </w:p>
+        </w:tc>
       </w:tr>
     </w:tbl>
     <w:p>
@@ -2862,7 +2917,33 @@
         <w:t xml:space="preserve">retrieval as the dominant lever (RQ1)</w:t>
       </w:r>
       <w:r>
-        <w:t xml:space="preserve">. The known-document upper bound makes the ceiling explicit: restricting retrieval to the correct filing lifts Retr@3 to 100%, coverage to 96/150, and F1 to 0.139—yet faithfulness stays low (0.20) and a third of questions remain unanswered, so finding the right filing is necessary but not sufficient. The residual failures—answered without grounded support—are exactly the cases our error analysis will taxonomize.</w:t>
+        <w:t xml:space="preserve">. Strict exact match is ~0 (short numeric answers formatted many ways: $1,577 vs. 1577.00 vs. 1.577 billion); a</w:t>
+      </w:r>
+      <w:r>
+        <w:t xml:space="preserve"> </w:t>
+      </w:r>
+      <w:r>
+        <w:rPr>
+          <w:bCs/>
+          <w:b/>
+        </w:rPr>
+        <w:t xml:space="preserve">numeric-tolerant EM</w:t>
+      </w:r>
+      <w:r>
+        <w:t xml:space="preserve"> </w:t>
+      </w:r>
+      <w:r>
+        <w:t xml:space="preserve">— right value within 1%, ignoring format — recovers the real accuracy and rises the same way (</w:t>
+      </w:r>
+      <w:r>
+        <w:rPr>
+          <w:bCs/>
+          <w:b/>
+        </w:rPr>
+        <w:t xml:space="preserve">0.12 → 0.18 → 0.21</w:t>
+      </w:r>
+      <w:r>
+        <w:t xml:space="preserve">, up to 0.27 for the ceiling), i.e. the strict metric understated correctness rather than the model being wrong. The known-document upper bound makes the ceiling explicit: restricting retrieval to the correct filing lifts Retr@3 to 100%, coverage to 96/150, and F1 to 0.139—yet faithfulness stays low (0.20) and a third of questions remain unanswered, so finding the right filing is necessary but not sufficient. The residual failures—answered without grounded support—are exactly the cases our error analysis will taxonomize.</w:t>
       </w:r>
     </w:p>
     <w:bookmarkEnd w:id="24"/>

</xml_diff>

<commit_message>
Stronger RAGAS judge (GPT-4o-mini) + answered-only faithfulness; single results table
- Re-ran RAGAS with a GPT-4o-mini judge (more reliable than GPT-3.5) on all 4 configs.
  Generator stays GPT-3.5 (RQ unaffected) — only the evaluator changed. Trend holds:
  faithfulness 0.10->0.20->0.21->0.30, ctx-prec 0.24->0.42->0.46 (lower/more conservative
  than GPT-3.5's over-scored 0.53->0.84), ans-rel 0.23->0.41->0.43.
- Added answered-only faithfulness (Faith(ans)) — abstentions score ~0 and drag the
  reported mean; on answered questions faithfulness is moderate (0.35-0.57).
- build_results_table: added Faith(ans) column, table* (full width), GPT-4o-mini caption.
- Paper: collapsed the redundant GPT-3.5 baseline table into a single GPT-4o-mini
  comparison table (removes the dual-judge inconsistency); rewrote Results narrative with
  the new numbers + answered-only faithfulness + numeric-EM. docx regenerated; compiles.

Co-Authored-By: Claude Opus 4.8 (1M context) <noreply@anthropic.com>
</commit_message>
<xml_diff>
--- a/paper/main.docx
+++ b/paper/main.docx
@@ -2029,7 +2029,7 @@
       </w:r>
     </w:p>
     <w:bookmarkEnd w:id="23"/>
-    <w:bookmarkStart w:id="25" w:name="preliminary-method-and-results"/>
+    <w:bookmarkStart w:id="24" w:name="preliminary-method-and-results"/>
     <w:p>
       <w:pPr>
         <w:pStyle w:val="1"/>
@@ -2047,25 +2047,13 @@
           <w:bCs/>
           <w:b/>
         </w:rPr>
-        <w:t xml:space="preserve">Baseline pipeline.</w:t>
-      </w:r>
-      <w:r>
-        <w:t xml:space="preserve"> </w:t>
-      </w:r>
-      <w:r>
-        <w:t xml:space="preserve">For each question we build a BM25 index</w:t>
-      </w:r>
-      <w:r>
-        <w:t xml:space="preserve"> </w:t>
-      </w:r>
-      <w:r>
-        <w:t xml:space="preserve">(Robertson and Zaragoza 2009)</w:t>
-      </w:r>
-      <w:r>
-        <w:t xml:space="preserve"> </w:t>
-      </w:r>
-      <w:r>
-        <w:t xml:space="preserve">over the</w:t>
+        <w:t xml:space="preserve">Pipelines.</w:t>
+      </w:r>
+      <w:r>
+        <w:t xml:space="preserve"> </w:t>
+      </w:r>
+      <w:r>
+        <w:t xml:space="preserve">All configurations share the same GPT-3.5-turbo generator (temperature 0), prompt, 512-token chunks, and top-3 retrieval; only</w:t>
       </w:r>
       <w:r>
         <w:t xml:space="preserve"> </w:t>
@@ -2075,31 +2063,71 @@
           <w:iCs/>
           <w:i/>
         </w:rPr>
-        <w:t xml:space="preserve">entire</w:t>
-      </w:r>
-      <w:r>
-        <w:t xml:space="preserve"> </w:t>
-      </w:r>
-      <w:r>
-        <w:t xml:space="preserve">chunk corpus (all 84 filings, fixed 512-token chunks), retrieve the top-3 chunks, and prompt GPT-3.5-turbo (temperature 0) to answer using only that context, instructing it to say</w:t>
-      </w:r>
-      <w:r>
-        <w:t xml:space="preserve"> </w:t>
-      </w:r>
-      <w:r>
-        <w:t xml:space="preserve">“</w:t>
-      </w:r>
-      <w:r>
-        <w:t xml:space="preserve">I don’t know</w:t>
-      </w:r>
-      <w:r>
-        <w:t xml:space="preserve">”</w:t>
-      </w:r>
-      <w:r>
-        <w:t xml:space="preserve"> </w:t>
-      </w:r>
-      <w:r>
-        <w:t xml:space="preserve">when the answer is absent. We index the full corpus on purpose: a retriever that can surface the</w:t>
+        <w:t xml:space="preserve">retrieval</w:t>
+      </w:r>
+      <w:r>
+        <w:t xml:space="preserve"> </w:t>
+      </w:r>
+      <w:r>
+        <w:t xml:space="preserve">changes, which isolates its effect. We compare</w:t>
+      </w:r>
+      <w:r>
+        <w:t xml:space="preserve"> </w:t>
+      </w:r>
+      <w:r>
+        <w:rPr>
+          <w:bCs/>
+          <w:b/>
+        </w:rPr>
+        <w:t xml:space="preserve">Baseline</w:t>
+      </w:r>
+      <w:r>
+        <w:t xml:space="preserve"> </w:t>
+      </w:r>
+      <w:r>
+        <w:t xml:space="preserve">(BM25 sparse retrieval over the entire 84-filing corpus),</w:t>
+      </w:r>
+      <w:r>
+        <w:t xml:space="preserve"> </w:t>
+      </w:r>
+      <w:r>
+        <w:rPr>
+          <w:bCs/>
+          <w:b/>
+        </w:rPr>
+        <w:t xml:space="preserve">Dense</w:t>
+      </w:r>
+      <w:r>
+        <w:t xml:space="preserve"> </w:t>
+      </w:r>
+      <w:r>
+        <w:t xml:space="preserve">(FAISS over MiniLM embeddings), and</w:t>
+      </w:r>
+      <w:r>
+        <w:t xml:space="preserve"> </w:t>
+      </w:r>
+      <w:r>
+        <w:rPr>
+          <w:bCs/>
+          <w:b/>
+        </w:rPr>
+        <w:t xml:space="preserve">Enhanced</w:t>
+      </w:r>
+      <w:r>
+        <w:t xml:space="preserve"> </w:t>
+      </w:r>
+      <w:r>
+        <w:t xml:space="preserve">(an LLM rewrites the query before dense retrieval), plus a known-document upper bound (</w:t>
+      </w:r>
+      <w:r>
+        <w:rPr>
+          <w:bCs/>
+          <w:b/>
+        </w:rPr>
+        <w:t xml:space="preserve">Single-doc</w:t>
+      </w:r>
+      <w:r>
+        <w:t xml:space="preserve">: retrieval restricted to the question’s own filing). We index the full corpus on purpose—a retriever that can surface the</w:t>
       </w:r>
       <w:r>
         <w:t xml:space="preserve"> </w:t>
@@ -2115,7 +2143,25 @@
         <w:t xml:space="preserve"> </w:t>
       </w:r>
       <w:r>
-        <w:t xml:space="preserve">filing is exactly the setting where hallucination appears, which is what we study. Outputs follow a fixed schema so the same evaluation harness scores every future pipeline.</w:t>
+        <w:t xml:space="preserve">filing among 84 is exactly where hallucination appears. The prompt instructs the model to answer only from context and to say</w:t>
+      </w:r>
+      <w:r>
+        <w:t xml:space="preserve"> </w:t>
+      </w:r>
+      <w:r>
+        <w:t xml:space="preserve">“</w:t>
+      </w:r>
+      <w:r>
+        <w:t xml:space="preserve">I don’t know</w:t>
+      </w:r>
+      <w:r>
+        <w:t xml:space="preserve">”</w:t>
+      </w:r>
+      <w:r>
+        <w:t xml:space="preserve"> </w:t>
+      </w:r>
+      <w:r>
+        <w:t xml:space="preserve">when the answer is absent, so a wrong answer is a grounding failure rather than a memory guess. A fixed output schema lets one harness score every pipeline.</w:t>
       </w:r>
     </w:p>
     <w:p>
@@ -2145,7 +2191,7 @@
         <w:t xml:space="preserve"> </w:t>
       </w:r>
       <w:r>
-        <w:t xml:space="preserve">faithfulness, answer relevancy, and context precision (LLM judge: GPT-3.5-turbo; local sentence-transformer embeddings), plus SQuAD-style token F1 and Exact Match</w:t>
+        <w:t xml:space="preserve">faithfulness, answer relevancy, and context precision (LLM judge: GPT-4o-mini; local sentence-transformer embeddings), plus SQuAD-style token F1 and Exact Match</w:t>
       </w:r>
       <w:r>
         <w:t xml:space="preserve"> </w:t>
@@ -2154,262 +2200,39 @@
         <w:t xml:space="preserve">(Rajpurkar et al. 2016)</w:t>
       </w:r>
       <w:r>
-        <w:t xml:space="preserve"> </w:t>
-      </w:r>
-      <w:r>
-        <w:t xml:space="preserve">against gold answers. Because gold answers are short and formatted many ways ($1,577 vs. 1577.00), EM is expected to be low; we therefore also report F1 on the answered subset.</w:t>
-      </w:r>
-    </w:p>
-    <w:p>
-      <w:pPr>
-        <w:pStyle w:val="TableCaption"/>
-      </w:pPr>
-      <w:r>
-        <w:t xml:space="preserve">Preliminary baseline results on FinanceBench (all 150 questions). Generator and RAGAS judge: GPT-3.5-turbo at temperature 0; RAGAS embeddings are local sentence-transformers.</w:t>
-      </w:r>
-    </w:p>
-    <w:tbl>
-      <w:tblPr>
-        <w:tblStyle w:val="Table"/>
-        <w:tblW w:type="pct" w:w="0.0"/>
-        <w:tblLook w:firstRow="1" w:lastRow="0" w:firstColumn="0" w:lastColumn="0" w:noHBand="0" w:noVBand="0" w:val="0020"/>
-        <w:tblCaption w:val="Preliminary baseline results on FinanceBench (all 150 questions). Generator and RAGAS judge: GPT-3.5-turbo at temperature 0; RAGAS embeddings are local sentence-transformers."/>
-      </w:tblPr>
-      <w:tblGrid/>
-      <w:tr>
-        <w:tc>
-          <w:p>
-            <w:pPr>
-              <w:pStyle w:val="Compact"/>
-              <w:jc w:val="left"/>
-            </w:pPr>
-            <w:r>
-              <w:t xml:space="preserve">Pipeline</w:t>
-            </w:r>
-          </w:p>
-        </w:tc>
-        <w:tc>
-          <w:p>
-            <w:pPr>
-              <w:pStyle w:val="Compact"/>
-              <w:jc w:val="left"/>
-            </w:pPr>
-            <w:r>
-              <w:t xml:space="preserve">Model</w:t>
-            </w:r>
-          </w:p>
-        </w:tc>
-        <w:tc>
-          <w:p>
-            <w:pPr>
-              <w:pStyle w:val="Compact"/>
-              <w:jc w:val="left"/>
-            </w:pPr>
-            <w:r>
-              <w:t xml:space="preserve">Faithfulness</w:t>
-            </w:r>
-          </w:p>
-        </w:tc>
-        <w:tc>
-          <w:p>
-            <w:pPr>
-              <w:pStyle w:val="Compact"/>
-              <w:jc w:val="left"/>
-            </w:pPr>
-            <w:r>
-              <w:t xml:space="preserve">Answer Rel.</w:t>
-            </w:r>
-          </w:p>
-        </w:tc>
-        <w:tc>
-          <w:p>
-            <w:pPr>
-              <w:pStyle w:val="Compact"/>
-              <w:jc w:val="left"/>
-            </w:pPr>
-            <w:r>
-              <w:t xml:space="preserve">Context Prec.</w:t>
-            </w:r>
-          </w:p>
-        </w:tc>
-        <w:tc>
-          <w:p>
-            <w:pPr>
-              <w:pStyle w:val="Compact"/>
-              <w:jc w:val="left"/>
-            </w:pPr>
-            <w:r>
-              <w:t xml:space="preserve">EM</w:t>
-            </w:r>
-          </w:p>
-        </w:tc>
-        <w:tc>
-          <w:p>
-            <w:pPr>
-              <w:pStyle w:val="Compact"/>
-              <w:jc w:val="left"/>
-            </w:pPr>
-            <w:r>
-              <w:t xml:space="preserve">F1</w:t>
-            </w:r>
-          </w:p>
-        </w:tc>
-      </w:tr>
-      <w:tr>
-        <w:tc>
-          <w:p>
-            <w:pPr>
-              <w:pStyle w:val="Compact"/>
-              <w:jc w:val="left"/>
-            </w:pPr>
-            <w:r>
-              <w:t xml:space="preserve">baseline_bm25</w:t>
-            </w:r>
-          </w:p>
-        </w:tc>
-        <w:tc>
-          <w:p>
-            <w:pPr>
-              <w:pStyle w:val="Compact"/>
-              <w:jc w:val="left"/>
-            </w:pPr>
-            <w:r>
-              <w:t xml:space="preserve">gpt-3.5-turbo</w:t>
-            </w:r>
-          </w:p>
-        </w:tc>
-        <w:tc>
-          <w:p>
-            <w:pPr>
-              <w:pStyle w:val="Compact"/>
-              <w:jc w:val="left"/>
-            </w:pPr>
-            <w:r>
-              <w:t xml:space="preserve">0.102</w:t>
-            </w:r>
-          </w:p>
-        </w:tc>
-        <w:tc>
-          <w:p>
-            <w:pPr>
-              <w:pStyle w:val="Compact"/>
-              <w:jc w:val="left"/>
-            </w:pPr>
-            <w:r>
-              <w:t xml:space="preserve">0.211</w:t>
-            </w:r>
-          </w:p>
-        </w:tc>
-        <w:tc>
-          <w:p>
-            <w:pPr>
-              <w:pStyle w:val="Compact"/>
-              <w:jc w:val="left"/>
-            </w:pPr>
-            <w:r>
-              <w:t xml:space="preserve">0.534</w:t>
-            </w:r>
-          </w:p>
-        </w:tc>
-        <w:tc>
-          <w:p>
-            <w:pPr>
-              <w:pStyle w:val="Compact"/>
-              <w:jc w:val="left"/>
-            </w:pPr>
-            <w:r>
-              <w:t xml:space="preserve">0.000</w:t>
-            </w:r>
-          </w:p>
-        </w:tc>
-        <w:tc>
-          <w:p>
-            <w:pPr>
-              <w:pStyle w:val="Compact"/>
-              <w:jc w:val="left"/>
-            </w:pPr>
-            <w:r>
-              <w:t xml:space="preserve">0.083</w:t>
-            </w:r>
-          </w:p>
-        </w:tc>
-      </w:tr>
-    </w:tbl>
-    <w:p>
-      <w:pPr>
-        <w:pStyle w:val="BodyText"/>
-      </w:pPr>
+        <w:t xml:space="preserve">. Because gold answers are short numbers formatted many ways ($1,577 vs. 1577.00 vs. 1.577 billion), strict EM is near zero, so we also report a</w:t>
+      </w:r>
+      <w:r>
+        <w:t xml:space="preserve"> </w:t>
+      </w:r>
       <w:r>
         <w:rPr>
           <w:bCs/>
           <w:b/>
         </w:rPr>
-        <w:t xml:space="preserve">Interpretation.</w:t>
-      </w:r>
-      <w:r>
-        <w:t xml:space="preserve"> </w:t>
-      </w:r>
-      <w:r>
-        <w:t xml:space="preserve">The baseline pairs a plain BM25 retriever with GPT-3.5-turbo. BM25 surfaces the correct filing for only 43% of questions, so the generator—instructed to answer only from context—abstains on roughly two-thirds, answering 47 of 150. This caution is deliberate and safer than fabrication, but it caps coverage: token F1 is 0.083 over all questions and 0.261 on the answered subset, with exact match at zero because short numeric answers are written many ways ($1,577 vs. 1577.00) and rarely match after normalization. RAGAS reflects the same bottleneck: faithfulness (0.102) and answer relevancy (0.211) are low—an abstention has nothing to ground and does not address the question—while context precision (0.534) shows retrieval places a useful chunk near the top only about half the time. Read together, the picture is a retrieval-bound baseline: the generator rarely fabricates, but weak sparse retrieval leaves most questions unanswered. Closing that gap with dense and query-rewrite retrieval—and surfacing the answered-but-unsupported cases—is the focus of the next phase.</w:t>
-      </w:r>
-    </w:p>
-    <w:bookmarkStart w:id="24" w:name="retrieval-strategy-comparison"/>
-    <w:p>
-      <w:pPr>
-        <w:pStyle w:val="2"/>
-      </w:pPr>
-      <w:r>
-        <w:t xml:space="preserve">Retrieval-strategy comparison</w:t>
-      </w:r>
-    </w:p>
-    <w:p>
-      <w:pPr>
-        <w:pStyle w:val="FirstParagraph"/>
-      </w:pPr>
-      <w:r>
-        <w:t xml:space="preserve">To test whether better retrieval closes that gap, we add two stronger pipelines—</w:t>
+        <w:t xml:space="preserve">numeric-tolerant</w:t>
+      </w:r>
+      <w:r>
+        <w:t xml:space="preserve"> </w:t>
+      </w:r>
+      <w:r>
+        <w:t xml:space="preserve">EM (right value within 1%, ignoring format) and faithfulness on the</w:t>
+      </w:r>
+      <w:r>
+        <w:t xml:space="preserve"> </w:t>
       </w:r>
       <w:r>
         <w:rPr>
           <w:bCs/>
           <w:b/>
         </w:rPr>
-        <w:t xml:space="preserve">Dense</w:t>
-      </w:r>
-      <w:r>
-        <w:t xml:space="preserve"> </w:t>
-      </w:r>
-      <w:r>
-        <w:t xml:space="preserve">(FAISS over MiniLM embeddings) and</w:t>
-      </w:r>
-      <w:r>
-        <w:t xml:space="preserve"> </w:t>
-      </w:r>
-      <w:r>
-        <w:rPr>
-          <w:bCs/>
-          <w:b/>
-        </w:rPr>
-        <w:t xml:space="preserve">Enhanced</w:t>
-      </w:r>
-      <w:r>
-        <w:t xml:space="preserve"> </w:t>
-      </w:r>
-      <w:r>
-        <w:t xml:space="preserve">(an LLM rewrites the query before dense retrieval)—holding the generator, prompt, chunking, and top-</w:t>
-      </w:r>
-      <w:r>
-        <w:rPr>
-          <w:iCs/>
-          <w:i/>
-        </w:rPr>
-        <w:t xml:space="preserve">k</w:t>
-      </w:r>
-      <w:r>
-        <w:t xml:space="preserve"> </w:t>
-      </w:r>
-      <w:r>
-        <w:t xml:space="preserve">fixed so that only retrieval varies. The table reports all three against a known-document upper bound (retrieval restricted to the question’s own filing). Retr@3 = share of questions whose top-3 retrieval reached the correct filing.</w:t>
+        <w:t xml:space="preserve">answered</w:t>
+      </w:r>
+      <w:r>
+        <w:t xml:space="preserve"> </w:t>
+      </w:r>
+      <w:r>
+        <w:t xml:space="preserve">subset. Retr@3 = share of questions whose top-3 retrieval reached the correct filing.</w:t>
       </w:r>
     </w:p>
     <w:tbl>
@@ -2450,6 +2273,17 @@
             </w:pPr>
             <w:r>
               <w:t xml:space="preserve">Faithful.</w:t>
+            </w:r>
+          </w:p>
+        </w:tc>
+        <w:tc>
+          <w:p>
+            <w:pPr>
+              <w:pStyle w:val="Compact"/>
+              <w:jc w:val="left"/>
+            </w:pPr>
+            <w:r>
+              <w:t xml:space="preserve">Faith(ans)</w:t>
             </w:r>
           </w:p>
         </w:tc>
@@ -2539,7 +2373,7 @@
               <w:jc w:val="left"/>
             </w:pPr>
             <w:r>
-              <w:t xml:space="preserve">0.102</w:t>
+              <w:t xml:space="preserve">0.104</w:t>
             </w:r>
           </w:p>
         </w:tc>
@@ -2550,7 +2384,7 @@
               <w:jc w:val="left"/>
             </w:pPr>
             <w:r>
-              <w:t xml:space="preserve">0.211</w:t>
+              <w:t xml:space="preserve">0.408</w:t>
             </w:r>
           </w:p>
         </w:tc>
@@ -2561,7 +2395,18 @@
               <w:jc w:val="left"/>
             </w:pPr>
             <w:r>
-              <w:t xml:space="preserve">0.534</w:t>
+              <w:t xml:space="preserve">0.234</w:t>
+            </w:r>
+          </w:p>
+        </w:tc>
+        <w:tc>
+          <w:p>
+            <w:pPr>
+              <w:pStyle w:val="Compact"/>
+              <w:jc w:val="left"/>
+            </w:pPr>
+            <w:r>
+              <w:t xml:space="preserve">0.240</w:t>
             </w:r>
           </w:p>
         </w:tc>
@@ -2629,7 +2474,7 @@
               <w:jc w:val="left"/>
             </w:pPr>
             <w:r>
-              <w:t xml:space="preserve">0.179</w:t>
+              <w:t xml:space="preserve">0.197</w:t>
             </w:r>
           </w:p>
         </w:tc>
@@ -2640,7 +2485,7 @@
               <w:jc w:val="left"/>
             </w:pPr>
             <w:r>
-              <w:t xml:space="preserve">0.393</w:t>
+              <w:t xml:space="preserve">0.352</w:t>
             </w:r>
           </w:p>
         </w:tc>
@@ -2651,7 +2496,18 @@
               <w:jc w:val="left"/>
             </w:pPr>
             <w:r>
-              <w:t xml:space="preserve">0.770</w:t>
+              <w:t xml:space="preserve">0.414</w:t>
+            </w:r>
+          </w:p>
+        </w:tc>
+        <w:tc>
+          <w:p>
+            <w:pPr>
+              <w:pStyle w:val="Compact"/>
+              <w:jc w:val="left"/>
+            </w:pPr>
+            <w:r>
+              <w:t xml:space="preserve">0.417</w:t>
             </w:r>
           </w:p>
         </w:tc>
@@ -2719,7 +2575,7 @@
               <w:jc w:val="left"/>
             </w:pPr>
             <w:r>
-              <w:t xml:space="preserve">0.184</w:t>
+              <w:t xml:space="preserve">0.209</w:t>
             </w:r>
           </w:p>
         </w:tc>
@@ -2730,7 +2586,7 @@
               <w:jc w:val="left"/>
             </w:pPr>
             <w:r>
-              <w:t xml:space="preserve">0.418</w:t>
+              <w:t xml:space="preserve">0.353</w:t>
             </w:r>
           </w:p>
         </w:tc>
@@ -2741,7 +2597,18 @@
               <w:jc w:val="left"/>
             </w:pPr>
             <w:r>
-              <w:t xml:space="preserve">0.843</w:t>
+              <w:t xml:space="preserve">0.432</w:t>
+            </w:r>
+          </w:p>
+        </w:tc>
+        <w:tc>
+          <w:p>
+            <w:pPr>
+              <w:pStyle w:val="Compact"/>
+              <w:jc w:val="left"/>
+            </w:pPr>
+            <w:r>
+              <w:t xml:space="preserve">0.462</w:t>
             </w:r>
           </w:p>
         </w:tc>
@@ -2809,7 +2676,7 @@
               <w:jc w:val="left"/>
             </w:pPr>
             <w:r>
-              <w:t xml:space="preserve">0.203</w:t>
+              <w:t xml:space="preserve">0.300</w:t>
             </w:r>
           </w:p>
         </w:tc>
@@ -2820,7 +2687,7 @@
               <w:jc w:val="left"/>
             </w:pPr>
             <w:r>
-              <w:t xml:space="preserve">0.407</w:t>
+              <w:t xml:space="preserve">0.572</w:t>
             </w:r>
           </w:p>
         </w:tc>
@@ -2831,7 +2698,18 @@
               <w:jc w:val="left"/>
             </w:pPr>
             <w:r>
-              <w:t xml:space="preserve">0.777</w:t>
+              <w:t xml:space="preserve">0.424</w:t>
+            </w:r>
+          </w:p>
+        </w:tc>
+        <w:tc>
+          <w:p>
+            <w:pPr>
+              <w:pStyle w:val="Compact"/>
+              <w:jc w:val="left"/>
+            </w:pPr>
+            <w:r>
+              <w:t xml:space="preserve">0.435</w:t>
             </w:r>
           </w:p>
         </w:tc>
@@ -2875,7 +2753,17 @@
         <w:pStyle w:val="BodyText"/>
       </w:pPr>
       <w:r>
-        <w:t xml:space="preserve">Every metric improves monotonically as retrieval improves. The correct filing reaches the top-3 for</w:t>
+        <w:rPr>
+          <w:bCs/>
+          <w:b/>
+        </w:rPr>
+        <w:t xml:space="preserve">Results.</w:t>
+      </w:r>
+      <w:r>
+        <w:t xml:space="preserve"> </w:t>
+      </w:r>
+      <w:r>
+        <w:t xml:space="preserve">Every metric improves as retrieval improves. The correct filing reaches the top-3 for</w:t>
       </w:r>
       <w:r>
         <w:t xml:space="preserve"> </w:t>
@@ -2891,7 +2779,7 @@
         <w:t xml:space="preserve"> </w:t>
       </w:r>
       <w:r>
-        <w:t xml:space="preserve">of questions (BM25 → dense → rewrite); because the generator answers only from context, coverage rises in lockstep (</w:t>
+        <w:t xml:space="preserve">of questions (BM25 → dense → rewrite); because the model answers only from context, coverage rises in lockstep (</w:t>
       </w:r>
       <w:r>
         <w:rPr>
@@ -2904,7 +2792,7 @@
         <w:t xml:space="preserve"> </w:t>
       </w:r>
       <w:r>
-        <w:t xml:space="preserve">of 150 answered), as do token F1 (0.083 → 0.116 → 0.121) and all three RAGAS metrics—context precision climbs 0.53 → 0.77 → 0.84. Since only retrieval changed, this isolates</w:t>
+        <w:t xml:space="preserve">of 150), and so do context precision (0.24 → 0.42 → 0.46), faithfulness (0.10 → 0.20 → 0.21), token F1 (0.083 → 0.116 → 0.121), and numeric-tolerant EM (0.12 → 0.18 → 0.21). Since only retrieval changed, this isolates</w:t>
       </w:r>
       <w:r>
         <w:t xml:space="preserve"> </w:t>
@@ -2917,38 +2805,45 @@
         <w:t xml:space="preserve">retrieval as the dominant lever (RQ1)</w:t>
       </w:r>
       <w:r>
-        <w:t xml:space="preserve">. Strict exact match is ~0 (short numeric answers formatted many ways: $1,577 vs. 1577.00 vs. 1.577 billion); a</w:t>
+        <w:t xml:space="preserve">. Strict EM ~0 understates accuracy: the numeric-tolerant EM shows 33–42% of</w:t>
       </w:r>
       <w:r>
         <w:t xml:space="preserve"> </w:t>
       </w:r>
       <w:r>
         <w:rPr>
-          <w:bCs/>
-          <w:b/>
+          <w:iCs/>
+          <w:i/>
         </w:rPr>
-        <w:t xml:space="preserve">numeric-tolerant EM</w:t>
-      </w:r>
-      <w:r>
-        <w:t xml:space="preserve"> </w:t>
-      </w:r>
-      <w:r>
-        <w:t xml:space="preserve">— right value within 1%, ignoring format — recovers the real accuracy and rises the same way (</w:t>
-      </w:r>
-      <w:r>
-        <w:rPr>
-          <w:bCs/>
-          <w:b/>
-        </w:rPr>
-        <w:t xml:space="preserve">0.12 → 0.18 → 0.21</w:t>
-      </w:r>
-      <w:r>
-        <w:t xml:space="preserve">, up to 0.27 for the ceiling), i.e. the strict metric understated correctness rather than the model being wrong. The known-document upper bound makes the ceiling explicit: restricting retrieval to the correct filing lifts Retr@3 to 100%, coverage to 96/150, and F1 to 0.139—yet faithfulness stays low (0.20) and a third of questions remain unanswered, so finding the right filing is necessary but not sufficient. The residual failures—answered without grounded support—are exactly the cases our error analysis will taxonomize.</w:t>
+        <w:t xml:space="preserve">answered</w:t>
+      </w:r>
+      <w:r>
+        <w:t xml:space="preserve"> </w:t>
+      </w:r>
+      <w:r>
+        <w:t xml:space="preserve">questions are actually correct—the model was penalized for formatting, not errors. Faithfulness is low overall, but that is dominated by abstentions (an</w:t>
+      </w:r>
+      <w:r>
+        <w:t xml:space="preserve"> </w:t>
+      </w:r>
+      <w:r>
+        <w:t xml:space="preserve">“</w:t>
+      </w:r>
+      <w:r>
+        <w:t xml:space="preserve">I don’t know</w:t>
+      </w:r>
+      <w:r>
+        <w:t xml:space="preserve">”</w:t>
+      </w:r>
+      <w:r>
+        <w:t xml:space="preserve"> </w:t>
+      </w:r>
+      <w:r>
+        <w:t xml:space="preserve">has nothing to ground); on the answered subset it is moderate (0.35–0.57), i.e. when the model commits to an answer it is partly—not fully—grounded, which is precisely the hallucination we study. The known-document upper bound makes the ceiling explicit: restricting retrieval to the correct filing lifts Retr@3 to 100%, coverage to 96/150, F1 to 0.139, and answered-faithfulness to 0.57—yet a third of questions still go unanswered, so finding the right filing is necessary but not sufficient. Those answered-but-unsupported cases are exactly what our error analysis will taxonomize.</w:t>
       </w:r>
     </w:p>
     <w:bookmarkEnd w:id="24"/>
-    <w:bookmarkEnd w:id="25"/>
-    <w:bookmarkStart w:id="26" w:name="roadblocks-and-next-steps"/>
+    <w:bookmarkStart w:id="25" w:name="roadblocks-and-next-steps"/>
     <w:p>
       <w:pPr>
         <w:pStyle w:val="1"/>
@@ -2974,8 +2869,8 @@
         <w:t xml:space="preserve">) under the same retrieval config to test RQ3; and (3) manual annotation of 50 failure cases into our four-type taxonomy (numerical, entity, reasoning, unsupported extrapolation) to answer RQ2. The main risks are OpenAI API cost control (run once at temperature 0) and the fidelity of PDF table extraction, which flattens tables into linear text and is a known limitation we will quantify.</w:t>
       </w:r>
     </w:p>
-    <w:bookmarkEnd w:id="26"/>
-    <w:bookmarkStart w:id="53" w:name="references"/>
+    <w:bookmarkEnd w:id="25"/>
+    <w:bookmarkStart w:id="52" w:name="references"/>
     <w:p>
       <w:pPr>
         <w:pStyle w:val="1"/>
@@ -2984,8 +2879,8 @@
         <w:t xml:space="preserve">References</w:t>
       </w:r>
     </w:p>
-    <w:bookmarkStart w:id="52" w:name="refs"/>
-    <w:bookmarkStart w:id="27" w:name="ref-asai2024selfrag"/>
+    <w:bookmarkStart w:id="51" w:name="refs"/>
+    <w:bookmarkStart w:id="26" w:name="ref-asai2024selfrag"/>
     <w:p>
       <w:pPr>
         <w:pStyle w:val="Bibliography"/>
@@ -3025,8 +2920,8 @@
         <w:t xml:space="preserve">.</w:t>
       </w:r>
     </w:p>
-    <w:bookmarkEnd w:id="27"/>
-    <w:bookmarkStart w:id="28" w:name="ref-chen2024rgb"/>
+    <w:bookmarkEnd w:id="26"/>
+    <w:bookmarkStart w:id="27" w:name="ref-chen2024rgb"/>
     <w:p>
       <w:pPr>
         <w:pStyle w:val="Bibliography"/>
@@ -3060,8 +2955,8 @@
         <w:t xml:space="preserve">.</w:t>
       </w:r>
     </w:p>
-    <w:bookmarkEnd w:id="28"/>
-    <w:bookmarkStart w:id="29" w:name="ref-chen2021finqa"/>
+    <w:bookmarkEnd w:id="27"/>
+    <w:bookmarkStart w:id="28" w:name="ref-chen2021finqa"/>
     <w:p>
       <w:pPr>
         <w:pStyle w:val="Bibliography"/>
@@ -3101,8 +2996,8 @@
         <w:t xml:space="preserve">.</w:t>
       </w:r>
     </w:p>
-    <w:bookmarkEnd w:id="29"/>
-    <w:bookmarkStart w:id="30" w:name="ref-chen2022convfinqa"/>
+    <w:bookmarkEnd w:id="28"/>
+    <w:bookmarkStart w:id="29" w:name="ref-chen2022convfinqa"/>
     <w:p>
       <w:pPr>
         <w:pStyle w:val="Bibliography"/>
@@ -3142,8 +3037,8 @@
         <w:t xml:space="preserve">.</w:t>
       </w:r>
     </w:p>
-    <w:bookmarkEnd w:id="30"/>
-    <w:bookmarkStart w:id="31" w:name="ref-es2024ragas"/>
+    <w:bookmarkEnd w:id="29"/>
+    <w:bookmarkStart w:id="30" w:name="ref-es2024ragas"/>
     <w:p>
       <w:pPr>
         <w:pStyle w:val="Bibliography"/>
@@ -3183,8 +3078,8 @@
         <w:t xml:space="preserve">.</w:t>
       </w:r>
     </w:p>
-    <w:bookmarkEnd w:id="31"/>
-    <w:bookmarkStart w:id="32" w:name="ref-friel2024ragbench"/>
+    <w:bookmarkEnd w:id="30"/>
+    <w:bookmarkStart w:id="31" w:name="ref-friel2024ragbench"/>
     <w:p>
       <w:pPr>
         <w:pStyle w:val="Bibliography"/>
@@ -3218,8 +3113,8 @@
         <w:t xml:space="preserve">.</w:t>
       </w:r>
     </w:p>
-    <w:bookmarkEnd w:id="32"/>
-    <w:bookmarkStart w:id="33" w:name="ref-gao2023ragsurvey"/>
+    <w:bookmarkEnd w:id="31"/>
+    <w:bookmarkStart w:id="32" w:name="ref-gao2023ragsurvey"/>
     <w:p>
       <w:pPr>
         <w:pStyle w:val="Bibliography"/>
@@ -3247,8 +3142,8 @@
         <w:t xml:space="preserve">.</w:t>
       </w:r>
     </w:p>
-    <w:bookmarkEnd w:id="33"/>
-    <w:bookmarkStart w:id="34" w:name="ref-guu2020realm"/>
+    <w:bookmarkEnd w:id="32"/>
+    <w:bookmarkStart w:id="33" w:name="ref-guu2020realm"/>
     <w:p>
       <w:pPr>
         <w:pStyle w:val="Bibliography"/>
@@ -3288,8 +3183,8 @@
         <w:t xml:space="preserve">.</w:t>
       </w:r>
     </w:p>
-    <w:bookmarkEnd w:id="34"/>
-    <w:bookmarkStart w:id="35" w:name="ref-huang2023hallucinationsurvey"/>
+    <w:bookmarkEnd w:id="33"/>
+    <w:bookmarkStart w:id="34" w:name="ref-huang2023hallucinationsurvey"/>
     <w:p>
       <w:pPr>
         <w:pStyle w:val="Bibliography"/>
@@ -3317,8 +3212,8 @@
         <w:t xml:space="preserve">.</w:t>
       </w:r>
     </w:p>
-    <w:bookmarkEnd w:id="35"/>
-    <w:bookmarkStart w:id="36" w:name="ref-islam2023financebench"/>
+    <w:bookmarkEnd w:id="34"/>
+    <w:bookmarkStart w:id="35" w:name="ref-islam2023financebench"/>
     <w:p>
       <w:pPr>
         <w:pStyle w:val="Bibliography"/>
@@ -3352,8 +3247,8 @@
         <w:t xml:space="preserve">.</w:t>
       </w:r>
     </w:p>
-    <w:bookmarkEnd w:id="36"/>
-    <w:bookmarkStart w:id="37" w:name="ref-izacard2021fid"/>
+    <w:bookmarkEnd w:id="35"/>
+    <w:bookmarkStart w:id="36" w:name="ref-izacard2021fid"/>
     <w:p>
       <w:pPr>
         <w:pStyle w:val="Bibliography"/>
@@ -3387,8 +3282,8 @@
         <w:t xml:space="preserve">.</w:t>
       </w:r>
     </w:p>
-    <w:bookmarkEnd w:id="37"/>
-    <w:bookmarkStart w:id="38" w:name="ref-ji2023hallucination"/>
+    <w:bookmarkEnd w:id="36"/>
+    <w:bookmarkStart w:id="37" w:name="ref-ji2023hallucination"/>
     <w:p>
       <w:pPr>
         <w:pStyle w:val="Bibliography"/>
@@ -3419,8 +3314,8 @@
         <w:t xml:space="preserve">55 (12): 1–38.</w:t>
       </w:r>
     </w:p>
-    <w:bookmarkEnd w:id="38"/>
-    <w:bookmarkStart w:id="39" w:name="ref-jiang2023mistral"/>
+    <w:bookmarkEnd w:id="37"/>
+    <w:bookmarkStart w:id="38" w:name="ref-jiang2023mistral"/>
     <w:p>
       <w:pPr>
         <w:pStyle w:val="Bibliography"/>
@@ -3463,8 +3358,8 @@
         <w:t xml:space="preserve">.</w:t>
       </w:r>
     </w:p>
-    <w:bookmarkEnd w:id="39"/>
-    <w:bookmarkStart w:id="40" w:name="ref-karpukhin2020dpr"/>
+    <w:bookmarkEnd w:id="38"/>
+    <w:bookmarkStart w:id="39" w:name="ref-karpukhin2020dpr"/>
     <w:p>
       <w:pPr>
         <w:pStyle w:val="Bibliography"/>
@@ -3498,8 +3393,8 @@
         <w:t xml:space="preserve">.</w:t>
       </w:r>
     </w:p>
-    <w:bookmarkEnd w:id="40"/>
-    <w:bookmarkStart w:id="41" w:name="ref-lewis2020rag"/>
+    <w:bookmarkEnd w:id="39"/>
+    <w:bookmarkStart w:id="40" w:name="ref-lewis2020rag"/>
     <w:p>
       <w:pPr>
         <w:pStyle w:val="Bibliography"/>
@@ -3545,8 +3440,8 @@
         <w:t xml:space="preserve">.</w:t>
       </w:r>
     </w:p>
-    <w:bookmarkEnd w:id="41"/>
-    <w:bookmarkStart w:id="42" w:name="ref-ma2023queryrewriting"/>
+    <w:bookmarkEnd w:id="40"/>
+    <w:bookmarkStart w:id="41" w:name="ref-ma2023queryrewriting"/>
     <w:p>
       <w:pPr>
         <w:pStyle w:val="Bibliography"/>
@@ -3580,8 +3475,8 @@
         <w:t xml:space="preserve">.</w:t>
       </w:r>
     </w:p>
-    <w:bookmarkEnd w:id="42"/>
-    <w:bookmarkStart w:id="43" w:name="ref-manakul2023selfcheckgpt"/>
+    <w:bookmarkEnd w:id="41"/>
+    <w:bookmarkStart w:id="42" w:name="ref-manakul2023selfcheckgpt"/>
     <w:p>
       <w:pPr>
         <w:pStyle w:val="Bibliography"/>
@@ -3621,8 +3516,8 @@
         <w:t xml:space="preserve">.</w:t>
       </w:r>
     </w:p>
-    <w:bookmarkEnd w:id="43"/>
-    <w:bookmarkStart w:id="44" w:name="ref-min2023factscore"/>
+    <w:bookmarkEnd w:id="42"/>
+    <w:bookmarkStart w:id="43" w:name="ref-min2023factscore"/>
     <w:p>
       <w:pPr>
         <w:pStyle w:val="Bibliography"/>
@@ -3662,8 +3557,8 @@
         <w:t xml:space="preserve">.</w:t>
       </w:r>
     </w:p>
-    <w:bookmarkEnd w:id="44"/>
-    <w:bookmarkStart w:id="45" w:name="ref-niu2024ragtruth"/>
+    <w:bookmarkEnd w:id="43"/>
+    <w:bookmarkStart w:id="44" w:name="ref-niu2024ragtruth"/>
     <w:p>
       <w:pPr>
         <w:pStyle w:val="Bibliography"/>
@@ -3703,8 +3598,8 @@
         <w:t xml:space="preserve">.</w:t>
       </w:r>
     </w:p>
-    <w:bookmarkEnd w:id="45"/>
-    <w:bookmarkStart w:id="46" w:name="ref-rajpurkar2016squad"/>
+    <w:bookmarkEnd w:id="44"/>
+    <w:bookmarkStart w:id="45" w:name="ref-rajpurkar2016squad"/>
     <w:p>
       <w:pPr>
         <w:pStyle w:val="Bibliography"/>
@@ -3744,8 +3639,8 @@
         <w:t xml:space="preserve">.</w:t>
       </w:r>
     </w:p>
-    <w:bookmarkEnd w:id="46"/>
-    <w:bookmarkStart w:id="47" w:name="ref-reimers2019sbert"/>
+    <w:bookmarkEnd w:id="45"/>
+    <w:bookmarkStart w:id="46" w:name="ref-reimers2019sbert"/>
     <w:p>
       <w:pPr>
         <w:pStyle w:val="Bibliography"/>
@@ -3794,8 +3689,8 @@
         <w:t xml:space="preserve">.</w:t>
       </w:r>
     </w:p>
-    <w:bookmarkEnd w:id="47"/>
-    <w:bookmarkStart w:id="48" w:name="ref-robertson2009bm25"/>
+    <w:bookmarkEnd w:id="46"/>
+    <w:bookmarkStart w:id="47" w:name="ref-robertson2009bm25"/>
     <w:p>
       <w:pPr>
         <w:pStyle w:val="Bibliography"/>
@@ -3838,8 +3733,8 @@
         <w:t xml:space="preserve">3 (4): 333–89.</w:t>
       </w:r>
     </w:p>
-    <w:bookmarkEnd w:id="48"/>
-    <w:bookmarkStart w:id="49" w:name="ref-wu2023bloomberggpt"/>
+    <w:bookmarkEnd w:id="47"/>
+    <w:bookmarkStart w:id="48" w:name="ref-wu2023bloomberggpt"/>
     <w:p>
       <w:pPr>
         <w:pStyle w:val="Bibliography"/>
@@ -3873,8 +3768,8 @@
         <w:t xml:space="preserve">.</w:t>
       </w:r>
     </w:p>
-    <w:bookmarkEnd w:id="49"/>
-    <w:bookmarkStart w:id="50" w:name="ref-yang2023fingpt"/>
+    <w:bookmarkEnd w:id="48"/>
+    <w:bookmarkStart w:id="49" w:name="ref-yang2023fingpt"/>
     <w:p>
       <w:pPr>
         <w:pStyle w:val="Bibliography"/>
@@ -3908,8 +3803,8 @@
         <w:t xml:space="preserve">.</w:t>
       </w:r>
     </w:p>
-    <w:bookmarkEnd w:id="50"/>
-    <w:bookmarkStart w:id="51" w:name="ref-zhu2021tatqa"/>
+    <w:bookmarkEnd w:id="49"/>
+    <w:bookmarkStart w:id="50" w:name="ref-zhu2021tatqa"/>
     <w:p>
       <w:pPr>
         <w:pStyle w:val="Bibliography"/>
@@ -3949,9 +3844,9 @@
         <w:t xml:space="preserve">.</w:t>
       </w:r>
     </w:p>
+    <w:bookmarkEnd w:id="50"/>
     <w:bookmarkEnd w:id="51"/>
     <w:bookmarkEnd w:id="52"/>
-    <w:bookmarkEnd w:id="53"/>
     <w:sectPr>
       <w:footerReference r:id="rId9" w:type="default"/>
       <w:pgSz w:code="9" w:h="16819" w:w="11894"/>

</xml_diff>

<commit_message>
Paper: add T24 automatic-detection result
Add a "Toward automatic detection" paragraph to the Error Analysis section reporting the
RoBERTa/RAGTruth proof-of-concept (transfer F1 0.81; high-recall over-flagger, clears
only 1/11 grounded), and reframe the Future Work line accordingly.

Applied to main.md (source) and patched surgically into main.docx (new paragraph cloned
from the existing body-paragraph style; two-fragment edit of the future-work sentence),
so the hand-done Word formatting is preserved. No figure embedded — the confusion matrix
lives in results/fig_t24_confusion.png.
</commit_message>
<xml_diff>
--- a/paper/main.docx
+++ b/paper/main.docx
@@ -5957,6 +5957,28 @@
     </w:p>
     <w:p>
       <w:pPr>
+        <w:jc w:val="both"/>
+        <w:rPr>
+          <w:rFonts w:ascii="Times New Roman" w:hAnsi="Times New Roman" w:cs="Times New Roman"/>
+        </w:rPr>
+      </w:pPr>
+      <w:r>
+        <w:rPr>
+          <w:rFonts w:ascii="Times New Roman" w:hAnsi="Times New Roman" w:cs="Times New Roman"/>
+          <w:b/>
+          <w:bCs/>
+        </w:rPr>
+        <w:t xml:space="preserve">Toward automatic detection.</w:t>
+      </w:r>
+      <w:r>
+        <w:rPr>
+          <w:rFonts w:ascii="Times New Roman" w:hAnsi="Times New Roman" w:cs="Times New Roman"/>
+        </w:rPr>
+        <w:t xml:space="preserve"> As a proof of concept, we fine-tuned RoBERTa-base on the QA subset of RAGTruth (Niu et al. 2024) (a response is labeled hallucinated if it carries any annotated span) and applied it zero-shot to our 50 labeled cases. It transfers with F1 0.81 (precision 0.77, recall 0.85), catching 33 of 39 hallucinations—but it correctly clears only 1 of 11 grounded answers, and on the RAGTruth test split it behaves the same way (recall 0.92, precision 0.24). The detector is therefore a high-recall over-flagger: useful as a first-pass filter that rarely misses a hallucination, but too imprecise to trust unaided. A precise, calibrated detector remains future work.</w:t>
+      </w:r>
+    </w:p>
+    <w:p>
+      <w:pPr>
         <w:pStyle w:val="Heading1"/>
         <w:rPr>
           <w:rFonts w:ascii="Times New Roman" w:hAnsi="Times New Roman" w:cs="Times New Roman"/>
@@ -6143,7 +6165,7 @@
         <w:rPr>
           <w:rFonts w:ascii="Times New Roman" w:hAnsi="Times New Roman" w:cs="Times New Roman"/>
         </w:rPr>
-        <w:t xml:space="preserve"> Table-aware chunking that preserves headers; retrieval upgrades (Fusion-in-Decoder (Izacard and Grave 2021), Self-RAG (Asai et al. 2024)) to close the remaining recall gap; an automatic hallucination classifier supervised by RAGTruth (Niu et al. 2024) and validated against our human labels; and scaling the evaluation to the full benchmark.</w:t>
+        <w:t xml:space="preserve"> Table-aware chunking that preserves headers; retrieval upgrades (Fusion-in-Decoder (Izacard and Grave 2021), Self-RAG (Asai et al. 2024)) to close the remaining recall gap; turning our proof-of-concept RAGTruth-trained detector (Niu et al. 2024) into a precise, calibrated classifier (it currently over-flags); and scaling the evaluation to the full benchmark.</w:t>
       </w:r>
     </w:p>
     <w:p>

</xml_diff>

<commit_message>
Paper: title-page update + T24 table fixes; restore main.md frontmatter
main.docx (manual Word edits):
- Add a proper title page (title, authors, instructor, course line).
- Fix T24 metrics table: "Accur-acy"/"Preci-sion" header typos -> "Accuracy"/
  "Precision"; "RAGTruth-QAtest" -> "RAGTruth-QA test".

main.md:
- Title updated to match the docx title page.
- Restore valid YAML frontmatter: an auto-formatter had corrupted the abstract
  block ("abstract:" -> "Abstract:", block-scalar "|" collapsed onto one line,
  and a stray "--" left mid-header). Fixed so main.md stays a working pandoc
  source; verified it parses cleanly.
- Incidental table-padding reformatting from the same auto-formatter pass
  (cosmetic only, tables render the same).
</commit_message>
<xml_diff>
--- a/paper/main.docx
+++ b/paper/main.docx
@@ -2,320 +2,476 @@
 <file path=word/document.xml><?xml version="1.0" encoding="utf-8"?>
 <w:document xmlns:wpc="http://schemas.microsoft.com/office/word/2010/wordprocessingCanvas" xmlns:cx="http://schemas.microsoft.com/office/drawing/2014/chartex" xmlns:cx1="http://schemas.microsoft.com/office/drawing/2015/9/8/chartex" xmlns:cx2="http://schemas.microsoft.com/office/drawing/2015/10/21/chartex" xmlns:cx3="http://schemas.microsoft.com/office/drawing/2016/5/9/chartex" xmlns:cx4="http://schemas.microsoft.com/office/drawing/2016/5/10/chartex" xmlns:cx5="http://schemas.microsoft.com/office/drawing/2016/5/11/chartex" xmlns:cx6="http://schemas.microsoft.com/office/drawing/2016/5/12/chartex" xmlns:cx7="http://schemas.microsoft.com/office/drawing/2016/5/13/chartex" xmlns:cx8="http://schemas.microsoft.com/office/drawing/2016/5/14/chartex" xmlns:mc="http://schemas.openxmlformats.org/markup-compatibility/2006" xmlns:m="http://schemas.openxmlformats.org/officeDocument/2006/math" xmlns:aink="http://schemas.microsoft.com/office/drawing/2016/ink" xmlns:am3d="http://schemas.microsoft.com/office/drawing/2017/model3d" xmlns:oel="http://schemas.microsoft.com/office/2019/extlst" xmlns:r="http://schemas.openxmlformats.org/officeDocument/2006/relationships" xmlns:wp14="http://schemas.microsoft.com/office/word/2010/wordprocessingDrawing" xmlns:wp="http://schemas.openxmlformats.org/drawingml/2006/wordprocessingDrawing" xmlns:wpg="http://schemas.microsoft.com/office/word/2010/wordprocessingGroup" xmlns:wpi="http://schemas.microsoft.com/office/word/2010/wordprocessingInk" xmlns:wps="http://schemas.microsoft.com/office/word/2010/wordprocessingShape" xmlns:o="urn:schemas-microsoft-com:office:office" xmlns:v="urn:schemas-microsoft-com:vml" xmlns:w10="urn:schemas-microsoft-com:office:word" xmlns:w="http://schemas.openxmlformats.org/wordprocessingml/2006/main" xmlns:w14="http://schemas.microsoft.com/office/word/2010/wordml" xmlns:w15="http://schemas.microsoft.com/office/word/2012/wordml" xmlns:w16cei="http://schemas.microsoft.com/office/word/2026/wordml/cei" xmlns:w16cex="http://schemas.microsoft.com/office/word/2018/wordml/cex" xmlns:w16cid="http://schemas.microsoft.com/office/word/2016/wordml/cid" xmlns:w16="http://schemas.microsoft.com/office/word/2018/wordml" xmlns:w16sdtdh="http://schemas.microsoft.com/office/word/2020/wordml/sdtdatahash" xmlns:w16sdtfl="http://schemas.microsoft.com/office/word/2024/wordml/sdtformatlock" xmlns:w16se="http://schemas.microsoft.com/office/word/2015/wordml/symex" xmlns:w16du="http://schemas.microsoft.com/office/word/2023/wordml/word16du" xmlns:wne="http://schemas.microsoft.com/office/word/2006/wordml" mc:Ignorable="w14 w15 w16se w16cid w16 w16cex w16sdtdh w16sdtfl w16du wp14">
   <w:body>
+    <w:tbl>
+      <w:tblPr>
+        <w:tblStyle w:val="TableGrid"/>
+        <w:tblpPr w:leftFromText="180" w:rightFromText="180" w:vertAnchor="text" w:tblpY="1"/>
+        <w:tblOverlap w:val="never"/>
+        <w:tblW w:w="10080" w:type="dxa"/>
+        <w:tblBorders>
+          <w:top w:val="none" w:sz="0" w:space="0" w:color="auto"/>
+          <w:left w:val="none" w:sz="0" w:space="0" w:color="auto"/>
+          <w:bottom w:val="none" w:sz="0" w:space="0" w:color="auto"/>
+          <w:right w:val="none" w:sz="0" w:space="0" w:color="auto"/>
+          <w:insideH w:val="none" w:sz="0" w:space="0" w:color="auto"/>
+          <w:insideV w:val="none" w:sz="0" w:space="0" w:color="auto"/>
+        </w:tblBorders>
+        <w:tblLook w:val="04A0" w:firstRow="1" w:lastRow="0" w:firstColumn="1" w:lastColumn="0" w:noHBand="0" w:noVBand="1"/>
+      </w:tblPr>
+      <w:tblGrid>
+        <w:gridCol w:w="10080"/>
+      </w:tblGrid>
+      <w:tr>
+        <w:trPr>
+          <w:trHeight w:val="351"/>
+        </w:trPr>
+        <w:tc>
+          <w:tcPr>
+            <w:tcW w:w="11785" w:type="dxa"/>
+          </w:tcPr>
+          <w:p>
+            <w:pPr>
+              <w:pStyle w:val="ACLAbstractHeading"/>
+              <w:rPr>
+                <w:sz w:val="36"/>
+                <w:szCs w:val="36"/>
+              </w:rPr>
+            </w:pPr>
+            <w:bookmarkStart w:id="0" w:name="_Hlk501891334"/>
+            <w:r>
+              <w:rPr>
+                <w:sz w:val="36"/>
+                <w:szCs w:val="36"/>
+              </w:rPr>
+              <w:t>Analyzing Hallucination Patterns in</w:t>
+            </w:r>
+          </w:p>
+          <w:p>
+            <w:pPr>
+              <w:pStyle w:val="ACLAbstractHeading"/>
+              <w:rPr>
+                <w:sz w:val="36"/>
+                <w:szCs w:val="36"/>
+              </w:rPr>
+            </w:pPr>
+            <w:r>
+              <w:rPr>
+                <w:sz w:val="36"/>
+                <w:szCs w:val="36"/>
+              </w:rPr>
+              <w:t>R</w:t>
+            </w:r>
+            <w:r>
+              <w:rPr>
+                <w:sz w:val="36"/>
+                <w:szCs w:val="36"/>
+              </w:rPr>
+              <w:t>AG Bas</w:t>
+            </w:r>
+            <w:r>
+              <w:rPr>
+                <w:sz w:val="36"/>
+                <w:szCs w:val="36"/>
+              </w:rPr>
+              <w:t>ed Financial Question Answering</w:t>
+            </w:r>
+          </w:p>
+        </w:tc>
+      </w:tr>
+      <w:tr>
+        <w:trPr>
+          <w:trHeight w:val="289"/>
+        </w:trPr>
+        <w:tc>
+          <w:tcPr>
+            <w:tcW w:w="11785" w:type="dxa"/>
+          </w:tcPr>
+          <w:p>
+            <w:pPr>
+              <w:jc w:val="center"/>
+              <w:rPr>
+                <w:rFonts w:ascii="Times New Roman" w:hAnsi="Times New Roman" w:cs="Times New Roman"/>
+                <w:b/>
+                <w:sz w:val="24"/>
+                <w:szCs w:val="24"/>
+              </w:rPr>
+            </w:pPr>
+          </w:p>
+        </w:tc>
+      </w:tr>
+      <w:tr>
+        <w:trPr>
+          <w:trHeight w:val="859"/>
+        </w:trPr>
+        <w:tc>
+          <w:tcPr>
+            <w:tcW w:w="11785" w:type="dxa"/>
+          </w:tcPr>
+          <w:p>
+            <w:pPr>
+              <w:jc w:val="center"/>
+              <w:rPr>
+                <w:rFonts w:ascii="Times New Roman" w:hAnsi="Times New Roman" w:cs="Times New Roman"/>
+                <w:b/>
+                <w:bCs/>
+                <w:color w:val="0070C0"/>
+                <w:sz w:val="20"/>
+                <w:szCs w:val="20"/>
+              </w:rPr>
+            </w:pPr>
+            <w:r>
+              <w:rPr>
+                <w:rFonts w:ascii="Times New Roman" w:hAnsi="Times New Roman" w:cs="Times New Roman"/>
+                <w:b/>
+                <w:bCs/>
+                <w:color w:val="0070C0"/>
+                <w:sz w:val="20"/>
+                <w:szCs w:val="20"/>
+              </w:rPr>
+              <w:t>Bhalchandra Shinde, Piyush Daga, Anish Kelkar, Rituraj Singh</w:t>
+            </w:r>
+          </w:p>
+          <w:p>
+            <w:pPr>
+              <w:rPr>
+                <w:rFonts w:ascii="Times New Roman" w:hAnsi="Times New Roman" w:cs="Times New Roman"/>
+                <w:b/>
+                <w:bCs/>
+                <w:color w:val="0070C0"/>
+                <w:sz w:val="20"/>
+                <w:szCs w:val="20"/>
+              </w:rPr>
+            </w:pPr>
+          </w:p>
+          <w:p>
+            <w:pPr>
+              <w:jc w:val="center"/>
+              <w:rPr>
+                <w:rFonts w:ascii="Times New Roman" w:hAnsi="Times New Roman" w:cs="Times New Roman"/>
+                <w:b/>
+                <w:bCs/>
+                <w:sz w:val="24"/>
+                <w:szCs w:val="24"/>
+              </w:rPr>
+            </w:pPr>
+            <w:r>
+              <w:rPr>
+                <w:rFonts w:ascii="Times New Roman" w:hAnsi="Times New Roman" w:cs="Times New Roman"/>
+                <w:b/>
+                <w:bCs/>
+                <w:color w:val="0070C0"/>
+                <w:sz w:val="24"/>
+                <w:szCs w:val="24"/>
+              </w:rPr>
+              <w:t>Prof. Amir Silvio</w:t>
+            </w:r>
+          </w:p>
+        </w:tc>
+      </w:tr>
+      <w:tr>
+        <w:trPr>
+          <w:trHeight w:val="279"/>
+        </w:trPr>
+        <w:tc>
+          <w:tcPr>
+            <w:tcW w:w="11785" w:type="dxa"/>
+          </w:tcPr>
+          <w:p>
+            <w:pPr>
+              <w:jc w:val="center"/>
+              <w:rPr>
+                <w:rFonts w:ascii="Times New Roman" w:hAnsi="Times New Roman" w:cs="Times New Roman"/>
+                <w:b/>
+                <w:sz w:val="24"/>
+                <w:szCs w:val="24"/>
+              </w:rPr>
+            </w:pPr>
+          </w:p>
+        </w:tc>
+      </w:tr>
+      <w:tr>
+        <w:trPr>
+          <w:trHeight w:val="289"/>
+        </w:trPr>
+        <w:tc>
+          <w:tcPr>
+            <w:tcW w:w="11785" w:type="dxa"/>
+          </w:tcPr>
+          <w:p>
+            <w:pPr>
+              <w:jc w:val="center"/>
+              <w:rPr>
+                <w:rFonts w:ascii="Times New Roman" w:hAnsi="Times New Roman" w:cs="Times New Roman"/>
+                <w:b/>
+                <w:sz w:val="24"/>
+                <w:szCs w:val="24"/>
+              </w:rPr>
+            </w:pPr>
+          </w:p>
+        </w:tc>
+      </w:tr>
+      <w:tr>
+        <w:trPr>
+          <w:trHeight w:val="289"/>
+        </w:trPr>
+        <w:tc>
+          <w:tcPr>
+            <w:tcW w:w="11785" w:type="dxa"/>
+          </w:tcPr>
+          <w:p>
+            <w:pPr>
+              <w:jc w:val="center"/>
+              <w:rPr>
+                <w:rFonts w:ascii="Times New Roman" w:hAnsi="Times New Roman" w:cs="Times New Roman"/>
+                <w:b/>
+                <w:sz w:val="24"/>
+                <w:szCs w:val="24"/>
+              </w:rPr>
+            </w:pPr>
+            <w:r>
+              <w:rPr>
+                <w:rFonts w:ascii="Times New Roman" w:hAnsi="Times New Roman" w:cs="Times New Roman"/>
+                <w:b/>
+                <w:sz w:val="24"/>
+                <w:szCs w:val="24"/>
+              </w:rPr>
+              <w:t>CS6120 NLP Summer 2026 Course Project (Northeastern University, San Jose)</w:t>
+            </w:r>
+          </w:p>
+          <w:p>
+            <w:pPr>
+              <w:jc w:val="center"/>
+              <w:rPr>
+                <w:rFonts w:ascii="Times New Roman" w:hAnsi="Times New Roman" w:cs="Times New Roman"/>
+                <w:b/>
+                <w:sz w:val="24"/>
+                <w:szCs w:val="24"/>
+              </w:rPr>
+            </w:pPr>
+          </w:p>
+        </w:tc>
+      </w:tr>
+      <w:tr>
+        <w:trPr>
+          <w:trHeight w:val="368"/>
+        </w:trPr>
+        <w:tc>
+          <w:tcPr>
+            <w:tcW w:w="11785" w:type="dxa"/>
+          </w:tcPr>
+          <w:p>
+            <w:pPr>
+              <w:jc w:val="center"/>
+              <w:rPr>
+                <w:rFonts w:ascii="Times New Roman" w:hAnsi="Times New Roman" w:cs="Times New Roman"/>
+                <w:b/>
+                <w:sz w:val="24"/>
+                <w:szCs w:val="24"/>
+              </w:rPr>
+            </w:pPr>
+          </w:p>
+        </w:tc>
+      </w:tr>
+    </w:tbl>
+    <w:bookmarkEnd w:id="0"/>
     <w:p>
       <w:pPr>
-        <w:pStyle w:val="ACLAbstractHeading"/>
-        <w:rPr>
-          <w:sz w:val="36"/>
-          <w:szCs w:val="36"/>
-        </w:rPr>
-      </w:pPr>
-      <w:r>
-        <w:rPr>
-          <w:sz w:val="36"/>
-          <w:szCs w:val="36"/>
-        </w:rPr>
-        <w:t>Analyzing Hallucination Patterns in Retrieval-Augmented Financial Question Answering</w:t>
+        <w:jc w:val="both"/>
+        <w:rPr>
+          <w:rFonts w:ascii="Times New Roman" w:hAnsi="Times New Roman" w:cs="Times New Roman"/>
+        </w:rPr>
+      </w:pPr>
+      <w:r>
+        <w:rPr>
+          <w:rFonts w:ascii="Times New Roman" w:hAnsi="Times New Roman" w:cs="Times New Roman"/>
+        </w:rPr>
+        <w:t xml:space="preserve">Retrieval-augmented generation (RAG) grounds large language models (LLMs) in external documents, yet models still produce claims that contradict or exceed the retrieved evidence—a failure mode with acute consequences in finance, where a single wrong figure misleads. We study </w:t>
+      </w:r>
+      <w:r>
+        <w:rPr>
+          <w:rFonts w:ascii="Times New Roman" w:hAnsi="Times New Roman" w:cs="Times New Roman"/>
+          <w:i/>
+          <w:iCs/>
+        </w:rPr>
+        <w:t>when and how</w:t>
+      </w:r>
+      <w:r>
+        <w:rPr>
+          <w:rFonts w:ascii="Times New Roman" w:hAnsi="Times New Roman" w:cs="Times New Roman"/>
+        </w:rPr>
+        <w:t xml:space="preserve"> RAG systems hallucinate on financial question answering using the open-source subset of </w:t>
+      </w:r>
+      <w:r>
+        <w:rPr>
+          <w:rFonts w:ascii="Times New Roman" w:hAnsi="Times New Roman" w:cs="Times New Roman"/>
+          <w:b/>
+          <w:bCs/>
+        </w:rPr>
+        <w:t>FinanceBench</w:t>
+      </w:r>
+      <w:r>
+        <w:rPr>
+          <w:rFonts w:ascii="Times New Roman" w:hAnsi="Times New Roman" w:cs="Times New Roman"/>
+        </w:rPr>
+        <w:t xml:space="preserve"> (150 annotated questions over 84 SEC filings). We build four RAG configurations that differ only in retrieval—sparse (BM25), dense (FAISS + MiniLM), query-rewriting, and a known-document upper bound—and evaluate each with RAGAS faithfulness, context precision, and a numeric-tolerant exact match. Three findings emerge. </w:t>
+      </w:r>
+      <w:r>
+        <w:rPr>
+          <w:rFonts w:ascii="Times New Roman" w:hAnsi="Times New Roman" w:cs="Times New Roman"/>
+          <w:b/>
+          <w:bCs/>
+        </w:rPr>
+        <w:t>(RQ1)</w:t>
+      </w:r>
+      <w:r>
+        <w:rPr>
+          <w:rFonts w:ascii="Times New Roman" w:hAnsi="Times New Roman" w:cs="Times New Roman"/>
+        </w:rPr>
+        <w:t xml:space="preserve"> Retrieval, not generation, is the dominant lever: as the correct filing reaches the top-3 for 43%→64%→69% of questions, coverage, faithfulness, and accuracy all rise in lockstep; a retrieval-depth ablation (top-5 vs. top-3) confirms deeper retrieval helps. </w:t>
+      </w:r>
+      <w:r>
+        <w:rPr>
+          <w:rFonts w:ascii="Times New Roman" w:hAnsi="Times New Roman" w:cs="Times New Roman"/>
+          <w:b/>
+          <w:bCs/>
+        </w:rPr>
+        <w:t>(RQ2)</w:t>
+      </w:r>
+      <w:r>
+        <w:rPr>
+          <w:rFonts w:ascii="Times New Roman" w:hAnsi="Times New Roman" w:cs="Times New Roman"/>
+        </w:rPr>
+        <w:t xml:space="preserve"> A manual taxonomy of 50 answered-but-incorrect cases shows </w:t>
+      </w:r>
+      <w:r>
+        <w:rPr>
+          <w:rFonts w:ascii="Times New Roman" w:hAnsi="Times New Roman" w:cs="Times New Roman"/>
+          <w:i/>
+          <w:iCs/>
+        </w:rPr>
+        <w:t>numerical</w:t>
+      </w:r>
+      <w:r>
+        <w:rPr>
+          <w:rFonts w:ascii="Times New Roman" w:hAnsi="Times New Roman" w:cs="Times New Roman"/>
+        </w:rPr>
+        <w:t xml:space="preserve"> errors dominate (46%), followed by </w:t>
+      </w:r>
+      <w:r>
+        <w:rPr>
+          <w:rFonts w:ascii="Times New Roman" w:hAnsi="Times New Roman" w:cs="Times New Roman"/>
+          <w:i/>
+          <w:iCs/>
+        </w:rPr>
+        <w:t>entity</w:t>
+      </w:r>
+      <w:r>
+        <w:rPr>
+          <w:rFonts w:ascii="Times New Roman" w:hAnsi="Times New Roman" w:cs="Times New Roman"/>
+        </w:rPr>
+        <w:t xml:space="preserve"> (31%), </w:t>
+      </w:r>
+      <w:r>
+        <w:rPr>
+          <w:rFonts w:ascii="Times New Roman" w:hAnsi="Times New Roman" w:cs="Times New Roman"/>
+          <w:i/>
+          <w:iCs/>
+        </w:rPr>
+        <w:t>unsupported</w:t>
+      </w:r>
+      <w:r>
+        <w:rPr>
+          <w:rFonts w:ascii="Times New Roman" w:hAnsi="Times New Roman" w:cs="Times New Roman"/>
+        </w:rPr>
+        <w:t xml:space="preserve"> (15%), and </w:t>
+      </w:r>
+      <w:r>
+        <w:rPr>
+          <w:rFonts w:ascii="Times New Roman" w:hAnsi="Times New Roman" w:cs="Times New Roman"/>
+          <w:i/>
+          <w:iCs/>
+        </w:rPr>
+        <w:t>reasoning</w:t>
+      </w:r>
+      <w:r>
+        <w:rPr>
+          <w:rFonts w:ascii="Times New Roman" w:hAnsi="Times New Roman" w:cs="Times New Roman"/>
+        </w:rPr>
+        <w:t xml:space="preserve"> (8%) hallucinations; notably, ~22% of automatically flagged “failures” are in fact correct answers mis-scored by exact match, a caution for automatic hallucination metrics. </w:t>
+      </w:r>
+      <w:r>
+        <w:rPr>
+          <w:rFonts w:ascii="Times New Roman" w:hAnsi="Times New Roman" w:cs="Times New Roman"/>
+          <w:b/>
+          <w:bCs/>
+        </w:rPr>
+        <w:t>(RQ3)</w:t>
+      </w:r>
+      <w:r>
+        <w:rPr>
+          <w:rFonts w:ascii="Times New Roman" w:hAnsi="Times New Roman" w:cs="Times New Roman"/>
+        </w:rPr>
+        <w:t xml:space="preserve"> Swapping </w:t>
       </w:r>
     </w:p>
     <w:p>
       <w:pPr>
-        <w:rPr>
-          <w:rFonts w:ascii="Times New Roman" w:hAnsi="Times New Roman" w:cs="Times New Roman"/>
-          <w:b/>
-          <w:bCs/>
-          <w:sz w:val="20"/>
-          <w:szCs w:val="20"/>
-        </w:rPr>
-      </w:pPr>
+        <w:jc w:val="both"/>
+        <w:rPr>
+          <w:rFonts w:ascii="Times New Roman" w:hAnsi="Times New Roman" w:cs="Times New Roman"/>
+        </w:rPr>
+      </w:pPr>
+      <w:r>
+        <w:rPr>
+          <w:rFonts w:ascii="Times New Roman" w:hAnsi="Times New Roman" w:cs="Times New Roman"/>
+        </w:rPr>
+        <w:t xml:space="preserve">GPT-3.5-turbo for the open Mistral-7B-Instruct on </w:t>
+      </w:r>
+      <w:r>
+        <w:rPr>
+          <w:rFonts w:ascii="Times New Roman" w:hAnsi="Times New Roman" w:cs="Times New Roman"/>
+          <w:i/>
+          <w:iCs/>
+        </w:rPr>
+        <w:t>identical</w:t>
+      </w:r>
+      <w:r>
+        <w:rPr>
+          <w:rFonts w:ascii="Times New Roman" w:hAnsi="Times New Roman" w:cs="Times New Roman"/>
+        </w:rPr>
+        <w:t xml:space="preserve"> retrieved context makes the smaller model substantially </w:t>
+      </w:r>
+      <w:r>
+        <w:rPr>
+          <w:rFonts w:ascii="Times New Roman" w:hAnsi="Times New Roman" w:cs="Times New Roman"/>
+          <w:i/>
+          <w:iCs/>
+        </w:rPr>
+        <w:t>more</w:t>
+      </w:r>
+      <w:r>
+        <w:rPr>
+          <w:rFonts w:ascii="Times New Roman" w:hAnsi="Times New Roman" w:cs="Times New Roman"/>
+        </w:rPr>
+        <w:t xml:space="preserve"> faithful (0.59 vs. 0.21) and more numerically accurate, at the cost of answering fewer questions—so abstention behavior, not model scale, drives grounding here.</w:t>
+      </w:r>
     </w:p>
     <w:p>
       <w:pPr>
-        <w:rPr>
-          <w:rFonts w:ascii="Times New Roman" w:hAnsi="Times New Roman" w:cs="Times New Roman"/>
-          <w:b/>
-          <w:bCs/>
-          <w:sz w:val="20"/>
-          <w:szCs w:val="20"/>
+        <w:jc w:val="both"/>
+        <w:rPr>
+          <w:rFonts w:ascii="Times New Roman" w:hAnsi="Times New Roman" w:cs="Times New Roman"/>
         </w:rPr>
       </w:pPr>
     </w:p>
     <w:p>
       <w:pPr>
-        <w:rPr>
-          <w:rFonts w:ascii="Times New Roman" w:hAnsi="Times New Roman" w:cs="Times New Roman"/>
-          <w:b/>
-          <w:bCs/>
-          <w:sz w:val="20"/>
-          <w:szCs w:val="20"/>
-        </w:rPr>
-      </w:pPr>
-      <w:r>
-        <w:rPr>
-          <w:rFonts w:ascii="Times New Roman" w:hAnsi="Times New Roman" w:cs="Times New Roman"/>
-          <w:b/>
-          <w:bCs/>
-          <w:sz w:val="20"/>
-          <w:szCs w:val="20"/>
-        </w:rPr>
-        <w:t>Bhalchandra Shinde</w:t>
-      </w:r>
-      <w:r>
-        <w:rPr>
-          <w:rFonts w:ascii="Times New Roman" w:hAnsi="Times New Roman" w:cs="Times New Roman"/>
-          <w:b/>
-          <w:bCs/>
-          <w:sz w:val="20"/>
-          <w:szCs w:val="20"/>
-        </w:rPr>
-        <w:t xml:space="preserve">, </w:t>
-      </w:r>
-      <w:r>
-        <w:rPr>
-          <w:rFonts w:ascii="Times New Roman" w:hAnsi="Times New Roman" w:cs="Times New Roman"/>
-          <w:b/>
-          <w:bCs/>
-          <w:sz w:val="20"/>
-          <w:szCs w:val="20"/>
-        </w:rPr>
-        <w:t>Piyush Daga</w:t>
-      </w:r>
-      <w:r>
-        <w:rPr>
-          <w:rFonts w:ascii="Times New Roman" w:hAnsi="Times New Roman" w:cs="Times New Roman"/>
-          <w:b/>
-          <w:bCs/>
-          <w:sz w:val="20"/>
-          <w:szCs w:val="20"/>
-        </w:rPr>
-        <w:t xml:space="preserve">, </w:t>
-      </w:r>
-      <w:r>
-        <w:rPr>
-          <w:rFonts w:ascii="Times New Roman" w:hAnsi="Times New Roman" w:cs="Times New Roman"/>
-          <w:b/>
-          <w:bCs/>
-          <w:sz w:val="20"/>
-          <w:szCs w:val="20"/>
-        </w:rPr>
-        <w:t>Anish Kelkar</w:t>
-      </w:r>
-      <w:r>
-        <w:rPr>
-          <w:rFonts w:ascii="Times New Roman" w:hAnsi="Times New Roman" w:cs="Times New Roman"/>
-          <w:b/>
-          <w:bCs/>
-          <w:sz w:val="20"/>
-          <w:szCs w:val="20"/>
-        </w:rPr>
-        <w:t xml:space="preserve">, </w:t>
-      </w:r>
-      <w:r>
-        <w:rPr>
-          <w:rFonts w:ascii="Times New Roman" w:hAnsi="Times New Roman" w:cs="Times New Roman"/>
-          <w:b/>
-          <w:bCs/>
-          <w:sz w:val="20"/>
-          <w:szCs w:val="20"/>
-        </w:rPr>
-        <w:t>Rituraj Singh</w:t>
-      </w:r>
-    </w:p>
-    <w:p>
-      <w:pPr>
-        <w:rPr>
-          <w:rFonts w:ascii="Times New Roman" w:hAnsi="Times New Roman" w:cs="Times New Roman"/>
-          <w:b/>
-          <w:bCs/>
-          <w:sz w:val="20"/>
-          <w:szCs w:val="20"/>
-        </w:rPr>
-      </w:pPr>
-    </w:p>
-    <w:p>
-      <w:pPr>
-        <w:jc w:val="both"/>
-        <w:rPr>
-          <w:rFonts w:ascii="Times New Roman" w:hAnsi="Times New Roman" w:cs="Times New Roman"/>
-        </w:rPr>
-      </w:pPr>
-      <w:r>
-        <w:rPr>
-          <w:rFonts w:ascii="Times New Roman" w:hAnsi="Times New Roman" w:cs="Times New Roman"/>
-        </w:rPr>
-        <w:t xml:space="preserve">Retrieval-augmented generation (RAG) grounds large language models (LLMs) in external documents, yet models still produce claims that contradict or exceed the retrieved evidence—a failure mode with acute consequences in finance, where a single wrong figure misleads. We study </w:t>
-      </w:r>
-      <w:r>
-        <w:rPr>
-          <w:rFonts w:ascii="Times New Roman" w:hAnsi="Times New Roman" w:cs="Times New Roman"/>
-          <w:i/>
-          <w:iCs/>
-        </w:rPr>
-        <w:t>when and how</w:t>
-      </w:r>
-      <w:r>
-        <w:rPr>
-          <w:rFonts w:ascii="Times New Roman" w:hAnsi="Times New Roman" w:cs="Times New Roman"/>
-        </w:rPr>
-        <w:t xml:space="preserve"> RAG systems hallucinate on financial question answering using the open-source subset of </w:t>
-      </w:r>
-      <w:r>
-        <w:rPr>
-          <w:rFonts w:ascii="Times New Roman" w:hAnsi="Times New Roman" w:cs="Times New Roman"/>
-          <w:b/>
-          <w:bCs/>
-        </w:rPr>
-        <w:t>FinanceBench</w:t>
-      </w:r>
-      <w:r>
-        <w:rPr>
-          <w:rFonts w:ascii="Times New Roman" w:hAnsi="Times New Roman" w:cs="Times New Roman"/>
-        </w:rPr>
-        <w:t xml:space="preserve"> (150 annotated questions over 84 SEC filings). We build four RAG configurations that differ only in retrieval—sparse (BM25), dense (FAISS + MiniLM), query-rewriting, and a known-document upper bound—and evaluate each with RAGAS faithfulness, context precision, and a numeric-tolerant exact match. Three findings emerge. </w:t>
-      </w:r>
-      <w:r>
-        <w:rPr>
-          <w:rFonts w:ascii="Times New Roman" w:hAnsi="Times New Roman" w:cs="Times New Roman"/>
-          <w:b/>
-          <w:bCs/>
-        </w:rPr>
-        <w:t>(RQ1)</w:t>
-      </w:r>
-      <w:r>
-        <w:rPr>
-          <w:rFonts w:ascii="Times New Roman" w:hAnsi="Times New Roman" w:cs="Times New Roman"/>
-        </w:rPr>
-        <w:t xml:space="preserve"> Retrieval, not generation, is the dominant lever: as the correct filing reaches the top-3 for 43%→64%→69% of questions, coverage, faithfulness, and accuracy all rise in lockstep; a retrieval-depth ablation (top-5 vs. top-3) confirms deeper retrieval helps. </w:t>
-      </w:r>
-      <w:r>
-        <w:rPr>
-          <w:rFonts w:ascii="Times New Roman" w:hAnsi="Times New Roman" w:cs="Times New Roman"/>
-          <w:b/>
-          <w:bCs/>
-        </w:rPr>
-        <w:t>(RQ2)</w:t>
-      </w:r>
-      <w:r>
-        <w:rPr>
-          <w:rFonts w:ascii="Times New Roman" w:hAnsi="Times New Roman" w:cs="Times New Roman"/>
-        </w:rPr>
-        <w:t xml:space="preserve"> A manual taxonomy of 50 answered-but-incorrect cases shows </w:t>
-      </w:r>
-      <w:r>
-        <w:rPr>
-          <w:rFonts w:ascii="Times New Roman" w:hAnsi="Times New Roman" w:cs="Times New Roman"/>
-          <w:i/>
-          <w:iCs/>
-        </w:rPr>
-        <w:t>numerical</w:t>
-      </w:r>
-      <w:r>
-        <w:rPr>
-          <w:rFonts w:ascii="Times New Roman" w:hAnsi="Times New Roman" w:cs="Times New Roman"/>
-        </w:rPr>
-        <w:t xml:space="preserve"> errors dominate (46%), followed by </w:t>
-      </w:r>
-      <w:r>
-        <w:rPr>
-          <w:rFonts w:ascii="Times New Roman" w:hAnsi="Times New Roman" w:cs="Times New Roman"/>
-          <w:i/>
-          <w:iCs/>
-        </w:rPr>
-        <w:t>entity</w:t>
-      </w:r>
-      <w:r>
-        <w:rPr>
-          <w:rFonts w:ascii="Times New Roman" w:hAnsi="Times New Roman" w:cs="Times New Roman"/>
-        </w:rPr>
-        <w:t xml:space="preserve"> (31%), </w:t>
-      </w:r>
-      <w:r>
-        <w:rPr>
-          <w:rFonts w:ascii="Times New Roman" w:hAnsi="Times New Roman" w:cs="Times New Roman"/>
-          <w:i/>
-          <w:iCs/>
-        </w:rPr>
-        <w:t>unsupported</w:t>
-      </w:r>
-      <w:r>
-        <w:rPr>
-          <w:rFonts w:ascii="Times New Roman" w:hAnsi="Times New Roman" w:cs="Times New Roman"/>
-        </w:rPr>
-        <w:t xml:space="preserve"> (15%), and </w:t>
-      </w:r>
-      <w:r>
-        <w:rPr>
-          <w:rFonts w:ascii="Times New Roman" w:hAnsi="Times New Roman" w:cs="Times New Roman"/>
-          <w:i/>
-          <w:iCs/>
-        </w:rPr>
-        <w:t>reasoning</w:t>
-      </w:r>
-      <w:r>
-        <w:rPr>
-          <w:rFonts w:ascii="Times New Roman" w:hAnsi="Times New Roman" w:cs="Times New Roman"/>
-        </w:rPr>
-        <w:t xml:space="preserve"> (8%) hallucinations; notably, ~22% of automatically flagged “failures” are in fact correct answers mis-scored by exact match, a caution for automatic hallucination metrics. </w:t>
-      </w:r>
-      <w:r>
-        <w:rPr>
-          <w:rFonts w:ascii="Times New Roman" w:hAnsi="Times New Roman" w:cs="Times New Roman"/>
-          <w:b/>
-          <w:bCs/>
-        </w:rPr>
-        <w:t>(RQ3)</w:t>
-      </w:r>
-      <w:r>
-        <w:rPr>
-          <w:rFonts w:ascii="Times New Roman" w:hAnsi="Times New Roman" w:cs="Times New Roman"/>
-        </w:rPr>
-        <w:t xml:space="preserve"> Swapping GPT-3.5-turbo for the open Mistral-7B-Instruct on </w:t>
-      </w:r>
-      <w:r>
-        <w:rPr>
-          <w:rFonts w:ascii="Times New Roman" w:hAnsi="Times New Roman" w:cs="Times New Roman"/>
-          <w:i/>
-          <w:iCs/>
-        </w:rPr>
-        <w:t>identical</w:t>
-      </w:r>
-      <w:r>
-        <w:rPr>
-          <w:rFonts w:ascii="Times New Roman" w:hAnsi="Times New Roman" w:cs="Times New Roman"/>
-        </w:rPr>
-        <w:t xml:space="preserve"> retrieved context makes the smaller model substantially </w:t>
-      </w:r>
-      <w:r>
-        <w:rPr>
-          <w:rFonts w:ascii="Times New Roman" w:hAnsi="Times New Roman" w:cs="Times New Roman"/>
-          <w:i/>
-          <w:iCs/>
-        </w:rPr>
-        <w:t>more</w:t>
-      </w:r>
-      <w:r>
-        <w:rPr>
-          <w:rFonts w:ascii="Times New Roman" w:hAnsi="Times New Roman" w:cs="Times New Roman"/>
-        </w:rPr>
-        <w:t xml:space="preserve"> faithful (0.59 vs. 0.21) and more numerically accurate, at the cost of answering fewer questions—so abstention behavior, not model scale, drives grounding here.</w:t>
-      </w:r>
-    </w:p>
-    <w:p>
-      <w:pPr>
-        <w:jc w:val="both"/>
-        <w:rPr>
-          <w:rFonts w:ascii="Times New Roman" w:hAnsi="Times New Roman" w:cs="Times New Roman"/>
-        </w:rPr>
-      </w:pPr>
-    </w:p>
-    <w:p>
-      <w:pPr>
         <w:pStyle w:val="Heading1"/>
         <w:rPr>
           <w:rFonts w:ascii="Times New Roman" w:hAnsi="Times New Roman" w:cs="Times New Roman"/>
         </w:rPr>
       </w:pPr>
-      <w:bookmarkStart w:id="0" w:name="introduction"/>
+      <w:bookmarkStart w:id="1" w:name="introduction"/>
       <w:r>
         <w:rPr>
           <w:rFonts w:ascii="Times New Roman" w:hAnsi="Times New Roman" w:cs="Times New Roman"/>
@@ -500,6 +656,7 @@
           <w:b/>
           <w:bCs/>
         </w:rPr>
+        <w:lastRenderedPageBreak/>
         <w:t>Contributions by member.</w:t>
       </w:r>
       <w:r>
@@ -580,13 +737,12 @@
           <w:rFonts w:ascii="Times New Roman" w:hAnsi="Times New Roman" w:cs="Times New Roman"/>
         </w:rPr>
       </w:pPr>
-      <w:bookmarkStart w:id="1" w:name="related-work"/>
-      <w:bookmarkEnd w:id="0"/>
-      <w:r>
-        <w:rPr>
-          <w:rFonts w:ascii="Times New Roman" w:hAnsi="Times New Roman" w:cs="Times New Roman"/>
-        </w:rPr>
-        <w:lastRenderedPageBreak/>
+      <w:bookmarkStart w:id="2" w:name="related-work"/>
+      <w:bookmarkEnd w:id="1"/>
+      <w:r>
+        <w:rPr>
+          <w:rFonts w:ascii="Times New Roman" w:hAnsi="Times New Roman" w:cs="Times New Roman"/>
+        </w:rPr>
         <w:t>Related Work</w:t>
       </w:r>
     </w:p>
@@ -679,7 +835,13 @@
         <w:rPr>
           <w:rFonts w:ascii="Times New Roman" w:hAnsi="Times New Roman" w:cs="Times New Roman"/>
         </w:rPr>
-        <w:t xml:space="preserve"> regime we observe in FinanceBench, where only 2% of gold answers are verbatim in the evidence (Section 3). Second, swapping the document index updates the model’s world knowledge with no retraining, underscoring that retrieval quality—not generator memory—governs what a RAG system can ground, which is precisely the bottleneck our results expose. The two retrieval families we compare are defined by BM25 (Robertson and Zaragoza 2009), a probabilistic term-matching function that is our baseline retriever, and DPR (Karpukhin et al. 2020), which learns dense question/passage encoders and beats BM25 on most open-domain QA—motivating our dense pipeline. That dense pipeline embeds chunks with Sentence-BERT (Reimers and Gurevych 2019), a siamese-BERT model that produces semantically comparable sentence vectors, the encoder behind our MiniLM index. REALM (Guu et al. 2020) pre-trains the retriever jointly with a masked LM, and Fusion-in-Decoder (Izacard and Grave 2021) instead fuses many retrieved passages in the decoder; both integrate retrieval more deeply than our prompt-based setup and mark upgrade paths. Self-RAG (Asai et al. 2024) trains a model to decide </w:t>
+        <w:t xml:space="preserve"> regime we observe in FinanceBench, where only 2% of gold answers are verbatim in the evidence (Section 3). Second, swapping the document index updates the model’s world knowledge with no retraining, underscoring that retrieval quality—not generator memory—governs what a RAG system can ground, which is precisely the bottleneck our results expose. The two retrieval families we compare are defined by BM25 (Robertson and Zaragoza 2009), a probabilistic term-matching function that is our baseline retriever, and DPR (Karpukhin et al. 2020), which learns dense question/passage encoders and beats BM25 on most open-domain QA—motivating our dense pipeline. That dense pipeline embeds chunks with Sentence-BERT (Reimers and Gurevych 2019), a siamese-BERT model that produces semantically comparable sentence vectors, the encoder behind our MiniLM index. REALM (Guu et al. 2020) pre-trains the retriever jointly with a masked LM, and Fusion-in-Decoder (Izacard and Grave 2021) instead fuses many retrieved passages </w:t>
+      </w:r>
+      <w:r>
+        <w:rPr>
+          <w:rFonts w:ascii="Times New Roman" w:hAnsi="Times New Roman" w:cs="Times New Roman"/>
+        </w:rPr>
+        <w:t xml:space="preserve">in the decoder; both integrate retrieval more deeply than our prompt-based setup and mark upgrade paths. Self-RAG (Asai et al. 2024) trains a model to decide </w:t>
       </w:r>
       <w:r>
         <w:rPr>
@@ -715,13 +877,7 @@
         <w:rPr>
           <w:rFonts w:ascii="Times New Roman" w:hAnsi="Times New Roman" w:cs="Times New Roman"/>
         </w:rPr>
-        <w:t xml:space="preserve"> Ji et al. (2023) and Huang et al. (2023) survey hallucination in NLG and LLMs respectively and provide the </w:t>
-      </w:r>
-      <w:r>
-        <w:rPr>
-          <w:rFonts w:ascii="Times New Roman" w:hAnsi="Times New Roman" w:cs="Times New Roman"/>
-        </w:rPr>
-        <w:t>vocabulary (intrinsic vs. extrinsic, faithfulness vs. factuality) our taxonomy refines for finance. For measurement, RAGAS (Es et al. 2024) supplies reference-free metrics—faithfulness, answer relevancy, context precision—that we adopt as our primary hallucination signal. SelfCheckGPT (Manakul, Liusie, and Gales 2023) detects hallucination without external resources by sampling several responses and measuring their mutual consistency, while FActScore (Min et al. 2023) decomposes a generation into atomic facts and scores each against a source—two complementary detection lenses. RAGTruth (Niu et al. 2024) contributes a word-level hallucination corpus and taxonomy that could supervise an automatic classifier, and the RGB benchmark (J. Chen et al. 2024) evaluates LLM robustness to noisy retrieval—the “wrong context” condition our full-corpus retriever deliberately induces. We additionally report token-level F1/EM following the SQuAD protocol (Rajpurkar et al. 2016) to capture correctness that faithfulness alone misses, and note RAGBench (Friel, Belyi, and Sanyal 2024) as a cross-domain resource for future comparison.</w:t>
+        <w:t xml:space="preserve"> Ji et al. (2023) and Huang et al. (2023) survey hallucination in NLG and LLMs respectively and provide the vocabulary (intrinsic vs. extrinsic, faithfulness vs. factuality) our taxonomy refines for finance. For measurement, RAGAS (Es et al. 2024) supplies reference-free metrics—faithfulness, answer relevancy, context precision—that we adopt as our primary hallucination signal. SelfCheckGPT (Manakul, Liusie, and Gales 2023) detects hallucination without external resources by sampling several responses and measuring their mutual consistency, while FActScore (Min et al. 2023) decomposes a generation into atomic facts and scores each against a source—two complementary detection lenses. RAGTruth (Niu et al. 2024) contributes a word-level hallucination corpus and taxonomy that could supervise an automatic classifier, and the RGB benchmark (J. Chen et al. 2024) evaluates LLM robustness to noisy retrieval—the “wrong context” condition our full-corpus retriever deliberately induces. We additionally report token-level F1/EM following the SQuAD protocol (Rajpurkar et al. 2016) to capture correctness that faithfulness alone misses, and note RAGBench (Friel, Belyi, and Sanyal 2024) as a cross-domain resource for future comparison.</w:t>
       </w:r>
     </w:p>
     <w:p>
@@ -757,7 +913,14 @@
         <w:rPr>
           <w:rFonts w:ascii="Times New Roman" w:hAnsi="Times New Roman" w:cs="Times New Roman"/>
         </w:rPr>
-        <w:t xml:space="preserve"> rather than extraction—our EDA independently recovers this numeric skew (Section 3), and our taxonomy finds numerical errors are the most common hallucination (Section 6). (ii) Even the best realistic configuration (GPT-4-Turbo, long context) reaches only ~79% accuracy against an 85% oracle ceiling, and confident </w:t>
+        <w:t xml:space="preserve"> rather than extraction—our EDA independently recovers this numeric skew (Section 3), and our taxonomy finds numerical errors are the most common hallucination (Section 6). (ii) Even the best realistic configuration (GPT-4-Turbo, long context) </w:t>
+      </w:r>
+      <w:r>
+        <w:rPr>
+          <w:rFonts w:ascii="Times New Roman" w:hAnsi="Times New Roman" w:cs="Times New Roman"/>
+        </w:rPr>
+        <w:lastRenderedPageBreak/>
+        <w:t xml:space="preserve">reaches only ~79% accuracy against an 85% oracle ceiling, and confident </w:t>
       </w:r>
       <w:r>
         <w:rPr>
@@ -799,14 +962,7 @@
         <w:rPr>
           <w:rFonts w:ascii="Times New Roman" w:hAnsi="Times New Roman" w:cs="Times New Roman"/>
         </w:rPr>
-        <w:t xml:space="preserve"> the question helps. Prior financial QA datasets establish that numerical reasoning over hybrid table/text is the core difficulty our EDA also finds: FinQA (Z. Chen et al. 2021) pairs expert-written questions with executable reasoning programs over earnings-report tables; ConvFinQA (Z. Chen et al. 2022) extends </w:t>
-      </w:r>
-      <w:r>
-        <w:rPr>
-          <w:rFonts w:ascii="Times New Roman" w:hAnsi="Times New Roman" w:cs="Times New Roman"/>
-        </w:rPr>
-        <w:lastRenderedPageBreak/>
-        <w:t xml:space="preserve">this to multi-turn conversational chains; and TAT-QA (Zhu et al. 2021) targets questions that jointly span a table and its surrounding text—exactly the table+prose evidence our chunker must preserve. On the model side, BloombergGPT (Wu et al. 2023), a 50B model pre-trained on a large financial corpus, and FinGPT (Yang, Liu, and Wang 2023), an open finance-LLM framework, show the appetite for finance-specialized models but evaluate generation quality rather than isolating </w:t>
+        <w:t xml:space="preserve"> the question helps. Prior financial QA datasets establish that numerical reasoning over hybrid table/text is the core difficulty our EDA also finds: FinQA (Z. Chen et al. 2021) pairs expert-written questions with executable reasoning programs over earnings-report tables; ConvFinQA (Z. Chen et al. 2022) extends this to multi-turn conversational chains; and TAT-QA (Zhu et al. 2021) targets questions that jointly span a table and its surrounding text—exactly the table+prose evidence our chunker must preserve. On the model side, BloombergGPT (Wu et al. 2023), a 50B model pre-trained on a large financial corpus, and FinGPT (Yang, Liu, and Wang 2023), an open finance-LLM framework, show the appetite for finance-specialized models but evaluate generation quality rather than isolating </w:t>
       </w:r>
       <w:r>
         <w:rPr>
@@ -830,8 +986,8 @@
           <w:rFonts w:ascii="Times New Roman" w:hAnsi="Times New Roman" w:cs="Times New Roman"/>
         </w:rPr>
       </w:pPr>
-      <w:bookmarkStart w:id="2" w:name="data-and-exploratory-analysis"/>
-      <w:bookmarkEnd w:id="1"/>
+      <w:bookmarkStart w:id="3" w:name="data-and-exploratory-analysis"/>
+      <w:bookmarkEnd w:id="2"/>
       <w:r>
         <w:rPr>
           <w:rFonts w:ascii="Times New Roman" w:hAnsi="Times New Roman" w:cs="Times New Roman"/>
@@ -950,7 +1106,13 @@
         <w:rPr>
           <w:rFonts w:ascii="Times New Roman" w:hAnsi="Times New Roman" w:cs="Times New Roman"/>
         </w:rPr>
-        <w:t xml:space="preserve"> a value, not copy it, which is the core hallucination risk. (4) </w:t>
+        <w:t xml:space="preserve"> a value, not copy it, which is the core </w:t>
+      </w:r>
+      <w:r>
+        <w:rPr>
+          <w:rFonts w:ascii="Times New Roman" w:hAnsi="Times New Roman" w:cs="Times New Roman"/>
+        </w:rPr>
+        <w:t xml:space="preserve">hallucination risk. (4) </w:t>
       </w:r>
       <w:r>
         <w:rPr>
@@ -979,8 +1141,8 @@
           <w:noProof/>
         </w:rPr>
         <w:drawing>
-          <wp:inline distT="0" distB="0" distL="0" distR="0" wp14:anchorId="02602125" wp14:editId="76C05299">
-            <wp:extent cx="2934031" cy="2870421"/>
+          <wp:inline distT="0" distB="0" distL="0" distR="0" wp14:anchorId="02602125" wp14:editId="57320D6E">
+            <wp:extent cx="2933700" cy="2655736"/>
             <wp:effectExtent l="0" t="0" r="0" b="0"/>
             <wp:docPr id="1" name="Picture" descr="FinanceBench (open-source, n=150) overview: (a) balanced question types, (b) numeric reasoning dominates, (c) 10-K filings dominate the corpus, (d) gold answers are short."/>
             <wp:cNvGraphicFramePr/>
@@ -1002,7 +1164,7 @@
                   <pic:spPr bwMode="auto">
                     <a:xfrm>
                       <a:off x="0" y="0"/>
-                      <a:ext cx="2979447" cy="2914852"/>
+                      <a:ext cx="2986479" cy="2703514"/>
                     </a:xfrm>
                     <a:prstGeom prst="rect">
                       <a:avLst/>
@@ -1025,35 +1187,21 @@
       <w:pPr>
         <w:rPr>
           <w:rFonts w:ascii="Times New Roman" w:hAnsi="Times New Roman" w:cs="Times New Roman"/>
-          <w:sz w:val="20"/>
-          <w:szCs w:val="20"/>
-        </w:rPr>
-      </w:pPr>
-      <w:r>
-        <w:rPr>
-          <w:rFonts w:ascii="Times New Roman" w:hAnsi="Times New Roman" w:cs="Times New Roman"/>
-          <w:sz w:val="20"/>
-          <w:szCs w:val="20"/>
-        </w:rPr>
-        <w:t xml:space="preserve">FinanceBench (open-source, </w:t>
-      </w:r>
-      <w:r>
-        <w:rPr>
-          <w:rFonts w:ascii="Times New Roman" w:hAnsi="Times New Roman" w:cs="Times New Roman"/>
           <w:i/>
           <w:iCs/>
           <w:sz w:val="20"/>
           <w:szCs w:val="20"/>
         </w:rPr>
-        <w:t>n</w:t>
-      </w:r>
-      <w:r>
-        <w:rPr>
-          <w:rFonts w:ascii="Times New Roman" w:hAnsi="Times New Roman" w:cs="Times New Roman"/>
+      </w:pPr>
+      <w:r>
+        <w:rPr>
+          <w:rFonts w:ascii="Times New Roman" w:hAnsi="Times New Roman" w:cs="Times New Roman"/>
+          <w:i/>
+          <w:iCs/>
           <w:sz w:val="20"/>
           <w:szCs w:val="20"/>
         </w:rPr>
-        <w:t>=150) overview: (a) balanced question types, (b) numeric reasoning dominates, (c) 10-K filings dominate the corpus, (d) gold answers are short.</w:t>
+        <w:t>FinanceBench (open-source, n=150) overview: (a) balanced question types, (b) numeric reasoning dominates, (c) 10-K filings dominate the corpus, (d) gold answers are short.</w:t>
       </w:r>
     </w:p>
     <w:p>
@@ -1063,8 +1211,8 @@
           <w:rFonts w:ascii="Times New Roman" w:hAnsi="Times New Roman" w:cs="Times New Roman"/>
         </w:rPr>
       </w:pPr>
-      <w:bookmarkStart w:id="3" w:name="method"/>
-      <w:bookmarkEnd w:id="2"/>
+      <w:bookmarkStart w:id="4" w:name="method"/>
+      <w:bookmarkEnd w:id="3"/>
       <w:r>
         <w:rPr>
           <w:rFonts w:ascii="Times New Roman" w:hAnsi="Times New Roman" w:cs="Times New Roman"/>
@@ -1205,7 +1353,14 @@
         <w:rPr>
           <w:rFonts w:ascii="Times New Roman" w:hAnsi="Times New Roman" w:cs="Times New Roman"/>
         </w:rPr>
-        <w:t xml:space="preserve"> — an LLM first rewrites the question into a retrieval query (spelling out abbreviations, adding financial line-item terms), then dense retrieval runs on the rewritten query.</w:t>
+        <w:t xml:space="preserve"> — an LLM first rewrites the question into a retrieval query (spelling out </w:t>
+      </w:r>
+      <w:r>
+        <w:rPr>
+          <w:rFonts w:ascii="Times New Roman" w:hAnsi="Times New Roman" w:cs="Times New Roman"/>
+        </w:rPr>
+        <w:lastRenderedPageBreak/>
+        <w:t>abbreviations, adding financial line-item terms), then dense retrieval runs on the rewritten query.</w:t>
       </w:r>
     </w:p>
     <w:p>
@@ -1231,14 +1386,7 @@
         <w:rPr>
           <w:rFonts w:ascii="Times New Roman" w:hAnsi="Times New Roman" w:cs="Times New Roman"/>
         </w:rPr>
-        <w:t xml:space="preserve"> — a known-document upper bound: dense retrieval restricted to the </w:t>
-      </w:r>
-      <w:r>
-        <w:rPr>
-          <w:rFonts w:ascii="Times New Roman" w:hAnsi="Times New Roman" w:cs="Times New Roman"/>
-        </w:rPr>
-        <w:lastRenderedPageBreak/>
-        <w:t xml:space="preserve">question’s own filing, isolating </w:t>
+        <w:t xml:space="preserve"> — a known-document upper bound: dense retrieval restricted to the question’s own filing, isolating </w:t>
       </w:r>
       <w:r>
         <w:rPr>
@@ -1510,8 +1658,8 @@
           <w:rFonts w:ascii="Times New Roman" w:hAnsi="Times New Roman" w:cs="Times New Roman"/>
         </w:rPr>
       </w:pPr>
-      <w:bookmarkStart w:id="4" w:name="results"/>
-      <w:bookmarkEnd w:id="3"/>
+      <w:bookmarkStart w:id="5" w:name="results"/>
+      <w:bookmarkEnd w:id="4"/>
       <w:r>
         <w:rPr>
           <w:rFonts w:ascii="Times New Roman" w:hAnsi="Times New Roman" w:cs="Times New Roman"/>
@@ -1528,7 +1676,7 @@
           <w:szCs w:val="28"/>
         </w:rPr>
       </w:pPr>
-      <w:bookmarkStart w:id="5" w:name="rq1-retrieval-is-the-dominant-lever"/>
+      <w:bookmarkStart w:id="6" w:name="rq1-retrieval-is-the-dominant-lever"/>
       <w:r>
         <w:rPr>
           <w:rFonts w:ascii="Times New Roman" w:hAnsi="Times New Roman" w:cs="Times New Roman"/>
@@ -1563,13 +1711,7 @@
         <w:rPr>
           <w:rFonts w:ascii="Times New Roman" w:hAnsi="Times New Roman" w:cs="Times New Roman"/>
         </w:rPr>
-        <w:t xml:space="preserve"> of questions (BM25 → dense → rewrite); because the model answers only from context, </w:t>
-      </w:r>
-      <w:r>
-        <w:rPr>
-          <w:rFonts w:ascii="Times New Roman" w:hAnsi="Times New Roman" w:cs="Times New Roman"/>
-        </w:rPr>
-        <w:t>coverage rises in lockstep (</w:t>
+        <w:t xml:space="preserve"> of questions (BM25 → dense → rewrite); because the model answers only from context, coverage rises in lockstep (</w:t>
       </w:r>
       <w:r>
         <w:rPr>
@@ -1605,13 +1747,45 @@
         <w:jc w:val="both"/>
         <w:rPr>
           <w:rFonts w:ascii="Times New Roman" w:hAnsi="Times New Roman" w:cs="Times New Roman"/>
-        </w:rPr>
-      </w:pPr>
-      <w:r>
-        <w:rPr>
-          <w:rFonts w:ascii="Times New Roman" w:hAnsi="Times New Roman" w:cs="Times New Roman"/>
-        </w:rPr>
-        <w:t>Retrieval-strategy comparison on FinanceBench (all 150 questions). Generator = GPT-3.5-turbo (temp 0); RAGAS judge = GPT-4o-mini. Faith(ans) = faithfulness over answered questions only; EM (num) = numeric-tolerant exact match.</w:t>
+          <w:sz w:val="20"/>
+          <w:szCs w:val="20"/>
+        </w:rPr>
+      </w:pPr>
+      <w:r>
+        <w:rPr>
+          <w:rFonts w:ascii="Times New Roman" w:hAnsi="Times New Roman" w:cs="Times New Roman"/>
+          <w:b/>
+          <w:bCs/>
+          <w:sz w:val="20"/>
+          <w:szCs w:val="20"/>
+        </w:rPr>
+        <w:t xml:space="preserve">Table 1: </w:t>
+      </w:r>
+      <w:r>
+        <w:rPr>
+          <w:rFonts w:ascii="Times New Roman" w:hAnsi="Times New Roman" w:cs="Times New Roman"/>
+          <w:sz w:val="20"/>
+          <w:szCs w:val="20"/>
+        </w:rPr>
+        <w:t xml:space="preserve">Retrieval-strategy comparison on </w:t>
+      </w:r>
+      <w:proofErr w:type="spellStart"/>
+      <w:r>
+        <w:rPr>
+          <w:rFonts w:ascii="Times New Roman" w:hAnsi="Times New Roman" w:cs="Times New Roman"/>
+          <w:sz w:val="20"/>
+          <w:szCs w:val="20"/>
+        </w:rPr>
+        <w:t>FinanceBench</w:t>
+      </w:r>
+      <w:proofErr w:type="spellEnd"/>
+      <w:r>
+        <w:rPr>
+          <w:rFonts w:ascii="Times New Roman" w:hAnsi="Times New Roman" w:cs="Times New Roman"/>
+          <w:sz w:val="20"/>
+          <w:szCs w:val="20"/>
+        </w:rPr>
+        <w:t xml:space="preserve"> (all 150 questions). Generator = GPT-3.5-turbo (temp 0); RAGAS judge = GPT-4o-mini. Faith(ans) = faithfulness over answered questions only; EM (num) = numeric-tolerant exact match.</w:t>
       </w:r>
     </w:p>
     <w:tbl>
@@ -1619,7 +1793,6 @@
         <w:tblStyle w:val="TableGridLight"/>
         <w:tblW w:w="5000" w:type="pct"/>
         <w:tblLook w:val="0020" w:firstRow="1" w:lastRow="0" w:firstColumn="0" w:lastColumn="0" w:noHBand="0" w:noVBand="0"/>
-        <w:tblCaption w:val="Retrieval-strategy comparison on FinanceBench (all 150 questions). Generator = GPT-3.5-turbo (temp 0); RAGAS judge = GPT-4o-mini. Faith(ans) = faithfulness over answered questions only; EM (num) = numeric-tolerant exact match."/>
       </w:tblPr>
       <w:tblGrid>
         <w:gridCol w:w="609"/>
@@ -2730,7 +2903,14 @@
         <w:rPr>
           <w:rFonts w:ascii="Times New Roman" w:hAnsi="Times New Roman" w:cs="Times New Roman"/>
         </w:rPr>
-        <w:t xml:space="preserve"> (an “I don’t know” has nothing to ground); on the answered subset faithfulness is moderate (0.35–0.57), i.e. when the model commits it is partly—not fully—grounded, which is exactly the hallucination we study. The known-document upper bound makes the ceiling explicit: restricting retrieval to the correct filing lifts Retr@3 to 100%, coverage to 96/150, F1 to 0.139, and answered-faithfulness to 0.57—yet a third of questions still go unanswered, so finding the right filing is necessary but not sufficient.</w:t>
+        <w:t xml:space="preserve"> (an “I don’t know” has nothing to ground); on the answered subset faithfulness is moderate (0.35–0.57), i.e. when the model commits it is partly—not fully—grounded, which is exactly the hallucination we study. The known-document upper bound makes the ceiling explicit: restricting retrieval to the correct filing lifts Retr@3 to 100%, coverage to 96/150, F1 to 0.139, and answered-</w:t>
+      </w:r>
+      <w:r>
+        <w:rPr>
+          <w:rFonts w:ascii="Times New Roman" w:hAnsi="Times New Roman" w:cs="Times New Roman"/>
+        </w:rPr>
+        <w:lastRenderedPageBreak/>
+        <w:t>faithfulness to 0.57—yet a third of questions still go unanswered, so finding the right filing is necessary but not sufficient.</w:t>
       </w:r>
     </w:p>
     <w:p>
@@ -2742,8 +2922,8 @@
           <w:szCs w:val="28"/>
         </w:rPr>
       </w:pPr>
-      <w:bookmarkStart w:id="6" w:name="retrieval-depth-ablation-top-k"/>
-      <w:bookmarkEnd w:id="5"/>
+      <w:bookmarkStart w:id="7" w:name="retrieval-depth-ablation-top-k"/>
+      <w:bookmarkEnd w:id="6"/>
       <w:r>
         <w:rPr>
           <w:rFonts w:ascii="Times New Roman" w:hAnsi="Times New Roman" w:cs="Times New Roman"/>
@@ -2792,14 +2972,7 @@
         <w:rPr>
           <w:rFonts w:ascii="Times New Roman" w:hAnsi="Times New Roman" w:cs="Times New Roman"/>
         </w:rPr>
-        <w:t xml:space="preserve"> 64% → 73%), lifts coverage (82 → 97 of </w:t>
-      </w:r>
-      <w:r>
-        <w:rPr>
-          <w:rFonts w:ascii="Times New Roman" w:hAnsi="Times New Roman" w:cs="Times New Roman"/>
-        </w:rPr>
-        <w:lastRenderedPageBreak/>
-        <w:t>150), and improves faithfulness (0.197 → 0.248), F1, and numeric-tolerant EM. Context precision dips slightly (0.42 → 0.39), as expected when more chunks are admitted, but the net effect is positive—consistent with retrieval recall being the binding constraint.</w:t>
+        <w:t xml:space="preserve"> 64% → 73%), lifts coverage (82 → 97 of 150), and improves faithfulness (0.197 → 0.248), F1, and numeric-tolerant EM. Context precision dips slightly (0.42 → 0.39), as expected when more chunks are admitted, but the net effect is positive—consistent with retrieval recall being the binding constraint.</w:t>
       </w:r>
     </w:p>
     <w:p>
@@ -2807,11 +2980,25 @@
         <w:jc w:val="both"/>
         <w:rPr>
           <w:rFonts w:ascii="Times New Roman" w:hAnsi="Times New Roman" w:cs="Times New Roman"/>
-        </w:rPr>
-      </w:pPr>
-      <w:r>
-        <w:rPr>
-          <w:rFonts w:ascii="Times New Roman" w:hAnsi="Times New Roman" w:cs="Times New Roman"/>
+          <w:sz w:val="20"/>
+          <w:szCs w:val="20"/>
+        </w:rPr>
+      </w:pPr>
+      <w:r>
+        <w:rPr>
+          <w:rFonts w:ascii="Times New Roman" w:hAnsi="Times New Roman" w:cs="Times New Roman"/>
+          <w:b/>
+          <w:bCs/>
+          <w:sz w:val="20"/>
+          <w:szCs w:val="20"/>
+        </w:rPr>
+        <w:t xml:space="preserve">Table 2: </w:t>
+      </w:r>
+      <w:r>
+        <w:rPr>
+          <w:rFonts w:ascii="Times New Roman" w:hAnsi="Times New Roman" w:cs="Times New Roman"/>
+          <w:sz w:val="20"/>
+          <w:szCs w:val="20"/>
         </w:rPr>
         <w:t>Retrieval-depth ablation on the dense pipeline (GPT-3.5, 512-token chunks, GPT-4o-mini judge).</w:t>
       </w:r>
@@ -2821,7 +3008,6 @@
         <w:tblStyle w:val="TableGridLight"/>
         <w:tblW w:w="0" w:type="pct"/>
         <w:tblLook w:val="0020" w:firstRow="1" w:lastRow="0" w:firstColumn="0" w:lastColumn="0" w:noHBand="0" w:noVBand="0"/>
-        <w:tblCaption w:val="Retrieval-depth ablation on the dense pipeline (GPT-3.5, 512-token chunks, GPT-4o-mini judge)."/>
       </w:tblPr>
       <w:tblGrid>
         <w:gridCol w:w="434"/>
@@ -3511,121 +3697,129 @@
     </w:tbl>
     <w:p>
       <w:pPr>
+        <w:spacing w:after="0"/>
+        <w:jc w:val="both"/>
+        <w:rPr>
+          <w:rFonts w:ascii="Times New Roman" w:hAnsi="Times New Roman" w:cs="Times New Roman"/>
+          <w:sz w:val="28"/>
+          <w:szCs w:val="28"/>
+        </w:rPr>
+      </w:pPr>
+      <w:bookmarkStart w:id="8" w:name="rq3-generator-held-to-identical-context"/>
+      <w:bookmarkEnd w:id="7"/>
+    </w:p>
+    <w:p>
+      <w:pPr>
         <w:pStyle w:val="Heading2"/>
-        <w:numPr>
-          <w:ilvl w:val="0"/>
-          <w:numId w:val="0"/>
-        </w:numPr>
-        <w:ind w:left="567" w:hanging="567"/>
+        <w:rPr>
+          <w:rFonts w:ascii="Times New Roman" w:hAnsi="Times New Roman" w:cs="Times New Roman"/>
+          <w:sz w:val="28"/>
+          <w:szCs w:val="28"/>
+        </w:rPr>
+      </w:pPr>
+      <w:r>
+        <w:rPr>
+          <w:rFonts w:ascii="Times New Roman" w:hAnsi="Times New Roman" w:cs="Times New Roman"/>
+          <w:sz w:val="28"/>
+          <w:szCs w:val="28"/>
+        </w:rPr>
+        <w:t>RQ3: Generator held to identical context</w:t>
+      </w:r>
+    </w:p>
+    <w:p>
+      <w:pPr>
+        <w:jc w:val="both"/>
+        <w:rPr>
+          <w:rFonts w:ascii="Times New Roman" w:hAnsi="Times New Roman" w:cs="Times New Roman"/>
+        </w:rPr>
+      </w:pPr>
+      <w:r>
+        <w:rPr>
+          <w:rFonts w:ascii="Times New Roman" w:hAnsi="Times New Roman" w:cs="Times New Roman"/>
+        </w:rPr>
+        <w:t xml:space="preserve">Table 3 compares GPT-3.5-turbo and Mistral-7B-Instruct answering over the </w:t>
+      </w:r>
+      <w:r>
+        <w:rPr>
+          <w:rFonts w:ascii="Times New Roman" w:hAnsi="Times New Roman" w:cs="Times New Roman"/>
+          <w:i/>
+          <w:iCs/>
+        </w:rPr>
+        <w:t>same</w:t>
+      </w:r>
+      <w:r>
+        <w:rPr>
+          <w:rFonts w:ascii="Times New Roman" w:hAnsi="Times New Roman" w:cs="Times New Roman"/>
+        </w:rPr>
+        <w:t xml:space="preserve"> retrieved contexts. Given identical evidence, the smaller open model is </w:t>
+      </w:r>
+      <w:r>
         <w:rPr>
           <w:rFonts w:ascii="Times New Roman" w:hAnsi="Times New Roman" w:cs="Times New Roman"/>
           <w:b/>
           <w:bCs/>
-          <w:sz w:val="28"/>
-          <w:szCs w:val="28"/>
-        </w:rPr>
-      </w:pPr>
-      <w:bookmarkStart w:id="7" w:name="rq3-generator-held-to-identical-context"/>
-      <w:bookmarkEnd w:id="6"/>
+        </w:rPr>
+        <w:t>markedly more faithful</w:t>
+      </w:r>
+      <w:r>
+        <w:rPr>
+          <w:rFonts w:ascii="Times New Roman" w:hAnsi="Times New Roman" w:cs="Times New Roman"/>
+        </w:rPr>
+        <w:t xml:space="preserve"> (0.59 vs. 0.21 overall; 0.63 vs. 0.35 on answered questions only, so the gap is not merely an abstention artifact) and nearly </w:t>
+      </w:r>
+      <w:r>
+        <w:rPr>
+          <w:rFonts w:ascii="Times New Roman" w:hAnsi="Times New Roman" w:cs="Times New Roman"/>
+          <w:b/>
+          <w:bCs/>
+        </w:rPr>
+        <w:t>twice as accurate on numbers</w:t>
+      </w:r>
+      <w:r>
+        <w:rPr>
+          <w:rFonts w:ascii="Times New Roman" w:hAnsi="Times New Roman" w:cs="Times New Roman"/>
+        </w:rPr>
+        <w:t xml:space="preserve"> (numeric-tolerant EM 0.37 vs. 0.21). The trade-off is coverage: Mistral is </w:t>
+      </w:r>
+      <w:r>
+        <w:rPr>
+          <w:rFonts w:ascii="Times New Roman" w:hAnsi="Times New Roman" w:cs="Times New Roman"/>
+          <w:b/>
+          <w:bCs/>
+        </w:rPr>
+        <w:t>more conservative</w:t>
+      </w:r>
+      <w:r>
+        <w:rPr>
+          <w:rFonts w:ascii="Times New Roman" w:hAnsi="Times New Roman" w:cs="Times New Roman"/>
+        </w:rPr>
+        <w:t>, answering 69/150 versus GPT-3.5’s 87 and preferring “I don’t know” over a guess. Its lower answer relevancy (0.25 vs. 0.43) largely reflects that higher abstention rate, since a refusal scores as not relevant to the question.</w:t>
+      </w:r>
     </w:p>
     <w:p>
       <w:pPr>
-        <w:pStyle w:val="Heading2"/>
-        <w:rPr>
-          <w:rFonts w:ascii="Times New Roman" w:hAnsi="Times New Roman" w:cs="Times New Roman"/>
-          <w:sz w:val="28"/>
-          <w:szCs w:val="28"/>
-        </w:rPr>
-      </w:pPr>
-      <w:r>
-        <w:rPr>
-          <w:rFonts w:ascii="Times New Roman" w:hAnsi="Times New Roman" w:cs="Times New Roman"/>
-          <w:sz w:val="28"/>
-          <w:szCs w:val="28"/>
-        </w:rPr>
-        <w:t>RQ3: Generator held to identical context</w:t>
-      </w:r>
-    </w:p>
-    <w:p>
-      <w:pPr>
         <w:jc w:val="both"/>
         <w:rPr>
           <w:rFonts w:ascii="Times New Roman" w:hAnsi="Times New Roman" w:cs="Times New Roman"/>
-        </w:rPr>
-      </w:pPr>
-      <w:r>
-        <w:rPr>
-          <w:rFonts w:ascii="Times New Roman" w:hAnsi="Times New Roman" w:cs="Times New Roman"/>
-        </w:rPr>
-        <w:t xml:space="preserve">Table 3 compares GPT-3.5-turbo and Mistral-7B-Instruct answering over the </w:t>
-      </w:r>
-      <w:r>
-        <w:rPr>
-          <w:rFonts w:ascii="Times New Roman" w:hAnsi="Times New Roman" w:cs="Times New Roman"/>
-          <w:i/>
-          <w:iCs/>
-        </w:rPr>
-        <w:t>same</w:t>
-      </w:r>
-      <w:r>
-        <w:rPr>
-          <w:rFonts w:ascii="Times New Roman" w:hAnsi="Times New Roman" w:cs="Times New Roman"/>
-        </w:rPr>
-        <w:t xml:space="preserve"> retrieved contexts. Given identical evidence, the smaller open model is </w:t>
-      </w:r>
+          <w:sz w:val="20"/>
+          <w:szCs w:val="20"/>
+        </w:rPr>
+      </w:pPr>
       <w:r>
         <w:rPr>
           <w:rFonts w:ascii="Times New Roman" w:hAnsi="Times New Roman" w:cs="Times New Roman"/>
           <w:b/>
           <w:bCs/>
-        </w:rPr>
-        <w:t>markedly more faithful</w:t>
-      </w:r>
-      <w:r>
-        <w:rPr>
-          <w:rFonts w:ascii="Times New Roman" w:hAnsi="Times New Roman" w:cs="Times New Roman"/>
-        </w:rPr>
-        <w:t xml:space="preserve"> (0.59 vs. 0.21 overall; 0.63 vs. 0.35 on answered questions only, so the gap is not merely an abstention artifact) and nearly </w:t>
-      </w:r>
-      <w:r>
-        <w:rPr>
-          <w:rFonts w:ascii="Times New Roman" w:hAnsi="Times New Roman" w:cs="Times New Roman"/>
-          <w:b/>
-          <w:bCs/>
-        </w:rPr>
-        <w:t>twice as accurate on numbers</w:t>
-      </w:r>
-      <w:r>
-        <w:rPr>
-          <w:rFonts w:ascii="Times New Roman" w:hAnsi="Times New Roman" w:cs="Times New Roman"/>
-        </w:rPr>
-        <w:t xml:space="preserve"> (numeric-tolerant EM 0.37 vs. 0.21). The trade-off is coverage: Mistral is </w:t>
-      </w:r>
-      <w:r>
-        <w:rPr>
-          <w:rFonts w:ascii="Times New Roman" w:hAnsi="Times New Roman" w:cs="Times New Roman"/>
-          <w:b/>
-          <w:bCs/>
-        </w:rPr>
-        <w:t>more conservative</w:t>
-      </w:r>
-      <w:r>
-        <w:rPr>
-          <w:rFonts w:ascii="Times New Roman" w:hAnsi="Times New Roman" w:cs="Times New Roman"/>
-        </w:rPr>
-        <w:t>, answering 69/150 versus GPT-3.5’s 87 and preferring “I don’t know” over a guess. Its lower answer relevancy (0.25 vs. 0.43) largely reflects that higher abstention rate, since a refusal scores as not relevant to the question.</w:t>
-      </w:r>
-    </w:p>
-    <w:p>
-      <w:pPr>
-        <w:jc w:val="both"/>
-        <w:rPr>
-          <w:rFonts w:ascii="Times New Roman" w:hAnsi="Times New Roman" w:cs="Times New Roman"/>
-        </w:rPr>
-      </w:pPr>
-      <w:r>
-        <w:rPr>
-          <w:rFonts w:ascii="Times New Roman" w:hAnsi="Times New Roman" w:cs="Times New Roman"/>
+          <w:sz w:val="20"/>
+          <w:szCs w:val="20"/>
+        </w:rPr>
+        <w:t xml:space="preserve">Table 3: </w:t>
+      </w:r>
+      <w:r>
+        <w:rPr>
+          <w:rFonts w:ascii="Times New Roman" w:hAnsi="Times New Roman" w:cs="Times New Roman"/>
+          <w:sz w:val="20"/>
+          <w:szCs w:val="20"/>
         </w:rPr>
         <w:t>Generator comparison on identical Enhanced retrieval (RQ3). Only the answer generator differs.</w:t>
       </w:r>
@@ -3635,7 +3829,6 @@
         <w:tblStyle w:val="TableGridLight"/>
         <w:tblW w:w="5000" w:type="pct"/>
         <w:tblLook w:val="0020" w:firstRow="1" w:lastRow="0" w:firstColumn="0" w:lastColumn="0" w:noHBand="0" w:noVBand="0"/>
-        <w:tblCaption w:val="Generator comparison on identical Enhanced retrieval (RQ3). Only the answer generator differs."/>
       </w:tblPr>
       <w:tblGrid>
         <w:gridCol w:w="745"/>
@@ -4221,6 +4414,14 @@
           <w:rFonts w:ascii="Times New Roman" w:hAnsi="Times New Roman" w:cs="Times New Roman"/>
         </w:rPr>
       </w:pPr>
+    </w:p>
+    <w:p>
+      <w:pPr>
+        <w:jc w:val="both"/>
+        <w:rPr>
+          <w:rFonts w:ascii="Times New Roman" w:hAnsi="Times New Roman" w:cs="Times New Roman"/>
+        </w:rPr>
+      </w:pPr>
       <w:r>
         <w:rPr>
           <w:rFonts w:ascii="Times New Roman" w:hAnsi="Times New Roman" w:cs="Times New Roman"/>
@@ -4263,9 +4464,9 @@
           <w:rFonts w:ascii="Times New Roman" w:hAnsi="Times New Roman" w:cs="Times New Roman"/>
         </w:rPr>
       </w:pPr>
-      <w:bookmarkStart w:id="8" w:name="Xb01618d9d9ed337f1dbb1f8dfd63b0099dd4e25"/>
-      <w:bookmarkEnd w:id="4"/>
-      <w:bookmarkEnd w:id="7"/>
+      <w:bookmarkStart w:id="9" w:name="Xb01618d9d9ed337f1dbb1f8dfd63b0099dd4e25"/>
+      <w:bookmarkEnd w:id="5"/>
+      <w:bookmarkEnd w:id="8"/>
       <w:r>
         <w:rPr>
           <w:rFonts w:ascii="Times New Roman" w:hAnsi="Times New Roman" w:cs="Times New Roman"/>
@@ -4566,7 +4767,14 @@
         <w:rPr>
           <w:rFonts w:ascii="Times New Roman" w:hAnsi="Times New Roman" w:cs="Times New Roman"/>
         </w:rPr>
-        <w:t xml:space="preserve"> from the right place, not stringing together a chain of inferences. Entity errors—the second most common—are overwhelmingly retrieval failures where the model answered confidently from the wrong filing, tying RQ2 back to the retrieval bottleneck of RQ1.</w:t>
+        <w:t xml:space="preserve"> from the right place, not stringing together a chain of inferences. Entity errors—the second most common—are overwhelmingly retrieval failures where the model answered confidently from the </w:t>
+      </w:r>
+      <w:r>
+        <w:rPr>
+          <w:rFonts w:ascii="Times New Roman" w:hAnsi="Times New Roman" w:cs="Times New Roman"/>
+        </w:rPr>
+        <w:lastRenderedPageBreak/>
+        <w:t>wrong filing, tying RQ2 back to the retrieval bottleneck of RQ1.</w:t>
       </w:r>
     </w:p>
     <w:p>
@@ -4588,10 +4796,9 @@
           <w:rFonts w:ascii="Times New Roman" w:hAnsi="Times New Roman" w:cs="Times New Roman"/>
           <w:noProof/>
         </w:rPr>
-        <w:lastRenderedPageBreak/>
         <w:drawing>
-          <wp:inline distT="0" distB="0" distL="0" distR="0" wp14:anchorId="1AF27703" wp14:editId="5FD8DC42">
-            <wp:extent cx="3245370" cy="1499017"/>
+          <wp:inline distT="0" distB="0" distL="0" distR="0" wp14:anchorId="1AF27703" wp14:editId="66931433">
+            <wp:extent cx="2918129" cy="1498600"/>
             <wp:effectExtent l="0" t="0" r="0" b="0"/>
             <wp:docPr id="1853978832" name="Picture" descr="Distribution of hallucination types over the 39 genuine answered-but-wrong cases."/>
             <wp:cNvGraphicFramePr/>
@@ -4613,7 +4820,7 @@
                   <pic:spPr bwMode="auto">
                     <a:xfrm>
                       <a:off x="0" y="0"/>
-                      <a:ext cx="3364721" cy="1554144"/>
+                      <a:ext cx="3062082" cy="1572527"/>
                     </a:xfrm>
                     <a:prstGeom prst="rect">
                       <a:avLst/>
@@ -4636,6 +4843,8 @@
       <w:pPr>
         <w:rPr>
           <w:rFonts w:ascii="Times New Roman" w:hAnsi="Times New Roman" w:cs="Times New Roman"/>
+          <w:i/>
+          <w:iCs/>
           <w:sz w:val="20"/>
           <w:szCs w:val="20"/>
         </w:rPr>
@@ -4643,6 +4852,8 @@
       <w:r>
         <w:rPr>
           <w:rFonts w:ascii="Times New Roman" w:hAnsi="Times New Roman" w:cs="Times New Roman"/>
+          <w:i/>
+          <w:iCs/>
           <w:sz w:val="20"/>
           <w:szCs w:val="20"/>
         </w:rPr>
@@ -4677,6 +4888,14 @@
           <w:rFonts w:ascii="Times New Roman" w:hAnsi="Times New Roman" w:cs="Times New Roman"/>
         </w:rPr>
       </w:pPr>
+      <w:r>
+        <w:rPr>
+          <w:rFonts w:ascii="Times New Roman" w:hAnsi="Times New Roman" w:cs="Times New Roman"/>
+          <w:b/>
+          <w:bCs/>
+        </w:rPr>
+        <w:t xml:space="preserve">Table 4: </w:t>
+      </w:r>
       <w:r>
         <w:rPr>
           <w:rFonts w:ascii="Times New Roman" w:hAnsi="Times New Roman" w:cs="Times New Roman"/>
@@ -4689,7 +4908,6 @@
         <w:tblStyle w:val="TableGridLight"/>
         <w:tblW w:w="4999" w:type="pct"/>
         <w:tblLook w:val="0020" w:firstRow="1" w:lastRow="0" w:firstColumn="0" w:lastColumn="0" w:noHBand="0" w:noVBand="0"/>
-        <w:tblCaption w:val="Representative case studies, two per hallucination type (from the 50 labeled cases)."/>
       </w:tblPr>
       <w:tblGrid>
         <w:gridCol w:w="816"/>
@@ -5322,7 +5540,15 @@
                 <w:sz w:val="18"/>
                 <w:szCs w:val="18"/>
               </w:rPr>
-              <w:t>Geographies it operates in (2022)</w:t>
+              <w:t xml:space="preserve">Geographies it operates </w:t>
+            </w:r>
+            <w:r>
+              <w:rPr>
+                <w:rFonts w:ascii="Times New Roman" w:hAnsi="Times New Roman" w:cs="Times New Roman"/>
+                <w:sz w:val="18"/>
+                <w:szCs w:val="18"/>
+              </w:rPr>
+              <w:t>in (2022)</w:t>
             </w:r>
           </w:p>
         </w:tc>
@@ -5412,15 +5638,7 @@
                 <w:sz w:val="18"/>
                 <w:szCs w:val="18"/>
               </w:rPr>
-              <w:t>Unsupp</w:t>
-            </w:r>
-            <w:r>
-              <w:rPr>
-                <w:rFonts w:ascii="Times New Roman" w:hAnsi="Times New Roman" w:cs="Times New Roman"/>
-                <w:sz w:val="18"/>
-                <w:szCs w:val="18"/>
-              </w:rPr>
-              <w:t>orted</w:t>
+              <w:t>Unsupported</w:t>
             </w:r>
           </w:p>
         </w:tc>
@@ -5952,8 +6170,8 @@
           <w:szCs w:val="22"/>
         </w:rPr>
       </w:pPr>
-      <w:bookmarkStart w:id="9" w:name="conclusion-limitations-and-future-work"/>
-      <w:bookmarkEnd w:id="8"/>
+      <w:bookmarkStart w:id="10" w:name="conclusion-limitations-and-future-work"/>
+      <w:bookmarkEnd w:id="9"/>
     </w:p>
     <w:p>
       <w:pPr>
@@ -5968,17 +6186,659 @@
           <w:b/>
           <w:bCs/>
         </w:rPr>
-        <w:t xml:space="preserve">Toward automatic detection.</w:t>
-      </w:r>
-      <w:r>
-        <w:rPr>
-          <w:rFonts w:ascii="Times New Roman" w:hAnsi="Times New Roman" w:cs="Times New Roman"/>
-        </w:rPr>
-        <w:t xml:space="preserve"> As a proof of concept, we fine-tuned RoBERTa-base on the QA subset of RAGTruth (Niu et al. 2024) (a response is labeled hallucinated if it carries any annotated span) and applied it zero-shot to our 50 labeled cases. It transfers with F1 0.81 (precision 0.77, recall 0.85), catching 33 of 39 hallucinations—but it correctly clears only 1 of 11 grounded answers, and on the RAGTruth test split it behaves the same way (recall 0.92, precision 0.24). The detector is therefore a high-recall over-flagger: useful as a first-pass filter that rarely misses a hallucination, but too imprecise to trust unaided. A precise, calibrated detector remains future work.</w:t>
+        <w:t>Toward automatic detection.</w:t>
+      </w:r>
+      <w:r>
+        <w:rPr>
+          <w:rFonts w:ascii="Times New Roman" w:hAnsi="Times New Roman" w:cs="Times New Roman"/>
+        </w:rPr>
+        <w:t xml:space="preserve"> As a proof of concept, we fine-tuned RoBERTa-base on the QA subset of RAGTruth (Niu et al. 2024) (a response is labeled hallucinated if it carries any annotated span) and applied it zero-shot to our 50 labeled cases</w:t>
+      </w:r>
+      <w:r>
+        <w:rPr>
+          <w:rFonts w:ascii="Times New Roman" w:hAnsi="Times New Roman" w:cs="Times New Roman"/>
+        </w:rPr>
+        <w:t xml:space="preserve"> (Table 5)</w:t>
+      </w:r>
+      <w:r>
+        <w:rPr>
+          <w:rFonts w:ascii="Times New Roman" w:hAnsi="Times New Roman" w:cs="Times New Roman"/>
+        </w:rPr>
+        <w:t>. It transfers with F1 0.81 (precision 0.77, recall 0.85), catching 33 of 39 hallucinations—but it correctly clears only 1 of 11 grounded answers, and on the RAGTruth test split it behaves the same way (recall 0.92, precision 0.24). The detector is therefore a high-recall over-flagger: useful as a first-pass filter that rarely misses a hallucination, but too imprecise to trust unaided. A precise, calibrated detector remains future work.</w:t>
       </w:r>
     </w:p>
     <w:p>
       <w:pPr>
+        <w:jc w:val="both"/>
+        <w:rPr>
+          <w:rFonts w:ascii="Times New Roman" w:hAnsi="Times New Roman" w:cs="Times New Roman"/>
+        </w:rPr>
+      </w:pPr>
+      <w:r>
+        <w:rPr>
+          <w:rFonts w:ascii="Times New Roman" w:hAnsi="Times New Roman" w:cs="Times New Roman"/>
+          <w:b/>
+          <w:bCs/>
+        </w:rPr>
+        <w:t xml:space="preserve">Table 5: </w:t>
+      </w:r>
+      <w:proofErr w:type="spellStart"/>
+      <w:r>
+        <w:rPr>
+          <w:rFonts w:ascii="Times New Roman" w:hAnsi="Times New Roman" w:cs="Times New Roman"/>
+        </w:rPr>
+        <w:t>RoBERTa</w:t>
+      </w:r>
+      <w:proofErr w:type="spellEnd"/>
+      <w:r>
+        <w:rPr>
+          <w:rFonts w:ascii="Times New Roman" w:hAnsi="Times New Roman" w:cs="Times New Roman"/>
+        </w:rPr>
+        <w:t xml:space="preserve"> hallucination-detector performance: fine-tuned on </w:t>
+      </w:r>
+      <w:proofErr w:type="spellStart"/>
+      <w:r>
+        <w:rPr>
+          <w:rFonts w:ascii="Times New Roman" w:hAnsi="Times New Roman" w:cs="Times New Roman"/>
+        </w:rPr>
+        <w:t>RAGTruth</w:t>
+      </w:r>
+      <w:proofErr w:type="spellEnd"/>
+      <w:r>
+        <w:rPr>
+          <w:rFonts w:ascii="Times New Roman" w:hAnsi="Times New Roman" w:cs="Times New Roman"/>
+        </w:rPr>
+        <w:t xml:space="preserve"> QA and evaluated on </w:t>
+      </w:r>
+      <w:proofErr w:type="gramStart"/>
+      <w:r>
+        <w:rPr>
+          <w:rFonts w:ascii="Times New Roman" w:hAnsi="Times New Roman" w:cs="Times New Roman"/>
+        </w:rPr>
+        <w:t>its</w:t>
+      </w:r>
+      <w:proofErr w:type="gramEnd"/>
+      <w:r>
+        <w:rPr>
+          <w:rFonts w:ascii="Times New Roman" w:hAnsi="Times New Roman" w:cs="Times New Roman"/>
+        </w:rPr>
+        <w:t xml:space="preserve"> </w:t>
+      </w:r>
+      <w:proofErr w:type="spellStart"/>
+      <w:r>
+        <w:rPr>
+          <w:rFonts w:ascii="Times New Roman" w:hAnsi="Times New Roman" w:cs="Times New Roman"/>
+        </w:rPr>
+        <w:t>held</w:t>
+      </w:r>
+      <w:proofErr w:type="spellEnd"/>
+      <w:r>
+        <w:rPr>
+          <w:rFonts w:ascii="Times New Roman" w:hAnsi="Times New Roman" w:cs="Times New Roman"/>
+        </w:rPr>
+        <w:t xml:space="preserve">-out test split and, zero-shot, on our 50 labeled </w:t>
+      </w:r>
+      <w:proofErr w:type="spellStart"/>
+      <w:r>
+        <w:rPr>
+          <w:rFonts w:ascii="Times New Roman" w:hAnsi="Times New Roman" w:cs="Times New Roman"/>
+        </w:rPr>
+        <w:t>FinanceBench</w:t>
+      </w:r>
+      <w:proofErr w:type="spellEnd"/>
+      <w:r>
+        <w:rPr>
+          <w:rFonts w:ascii="Times New Roman" w:hAnsi="Times New Roman" w:cs="Times New Roman"/>
+        </w:rPr>
+        <w:t xml:space="preserve"> cases.</w:t>
+      </w:r>
+    </w:p>
+    <w:tbl>
+      <w:tblPr>
+        <w:tblStyle w:val="TableGrid"/>
+        <w:tblW w:w="0" w:type="auto"/>
+        <w:tblLook w:val="04A0" w:firstRow="1" w:lastRow="0" w:firstColumn="1" w:lastColumn="0" w:noHBand="0" w:noVBand="1"/>
+      </w:tblPr>
+      <w:tblGrid>
+        <w:gridCol w:w="1306"/>
+        <w:gridCol w:w="672"/>
+        <w:gridCol w:w="666"/>
+        <w:gridCol w:w="877"/>
+        <w:gridCol w:w="696"/>
+        <w:gridCol w:w="621"/>
+      </w:tblGrid>
+      <w:tr>
+        <w:trPr>
+          <w:trHeight w:val="512"/>
+        </w:trPr>
+        <w:tc>
+          <w:tcPr>
+            <w:tcW w:w="1290" w:type="dxa"/>
+          </w:tcPr>
+          <w:p>
+            <w:pPr>
+              <w:jc w:val="both"/>
+              <w:rPr>
+                <w:rFonts w:ascii="Times New Roman" w:hAnsi="Times New Roman" w:cs="Times New Roman"/>
+                <w:b/>
+                <w:bCs/>
+                <w:sz w:val="18"/>
+                <w:szCs w:val="18"/>
+              </w:rPr>
+            </w:pPr>
+            <w:r>
+              <w:rPr>
+                <w:rFonts w:ascii="Times New Roman" w:hAnsi="Times New Roman" w:cs="Times New Roman"/>
+                <w:b/>
+                <w:bCs/>
+                <w:sz w:val="18"/>
+                <w:szCs w:val="18"/>
+              </w:rPr>
+              <w:t>Eval Set</w:t>
+            </w:r>
+          </w:p>
+        </w:tc>
+        <w:tc>
+          <w:tcPr>
+            <w:tcW w:w="708" w:type="dxa"/>
+          </w:tcPr>
+          <w:p>
+            <w:pPr>
+              <w:jc w:val="both"/>
+              <w:rPr>
+                <w:rFonts w:ascii="Times New Roman" w:hAnsi="Times New Roman" w:cs="Times New Roman"/>
+                <w:b/>
+                <w:bCs/>
+                <w:sz w:val="18"/>
+                <w:szCs w:val="18"/>
+              </w:rPr>
+            </w:pPr>
+            <w:r>
+              <w:rPr>
+                <w:rFonts w:ascii="Times New Roman" w:hAnsi="Times New Roman" w:cs="Times New Roman"/>
+                <w:b/>
+                <w:bCs/>
+                <w:sz w:val="18"/>
+                <w:szCs w:val="18"/>
+              </w:rPr>
+              <w:t>N</w:t>
+            </w:r>
+          </w:p>
+        </w:tc>
+        <w:tc>
+          <w:tcPr>
+            <w:tcW w:w="620" w:type="dxa"/>
+          </w:tcPr>
+          <w:p>
+            <w:pPr>
+              <w:jc w:val="both"/>
+              <w:rPr>
+                <w:rFonts w:ascii="Times New Roman" w:hAnsi="Times New Roman" w:cs="Times New Roman"/>
+                <w:b/>
+                <w:bCs/>
+                <w:sz w:val="18"/>
+                <w:szCs w:val="18"/>
+              </w:rPr>
+            </w:pPr>
+            <w:r>
+              <w:rPr>
+                <w:rFonts w:ascii="Times New Roman" w:hAnsi="Times New Roman" w:cs="Times New Roman"/>
+                <w:b/>
+                <w:bCs/>
+                <w:sz w:val="18"/>
+                <w:szCs w:val="18"/>
+              </w:rPr>
+              <w:t>Accu</w:t>
+            </w:r>
+            <w:r>
+              <w:rPr>
+                <w:rFonts w:ascii="Times New Roman" w:hAnsi="Times New Roman" w:cs="Times New Roman"/>
+                <w:b/>
+                <w:bCs/>
+                <w:sz w:val="18"/>
+                <w:szCs w:val="18"/>
+              </w:rPr>
+              <w:t>-</w:t>
+            </w:r>
+            <w:r>
+              <w:rPr>
+                <w:rFonts w:ascii="Times New Roman" w:hAnsi="Times New Roman" w:cs="Times New Roman"/>
+                <w:b/>
+                <w:bCs/>
+                <w:sz w:val="18"/>
+                <w:szCs w:val="18"/>
+              </w:rPr>
+              <w:t>racy</w:t>
+            </w:r>
+          </w:p>
+        </w:tc>
+        <w:tc>
+          <w:tcPr>
+            <w:tcW w:w="916" w:type="dxa"/>
+          </w:tcPr>
+          <w:p>
+            <w:pPr>
+              <w:jc w:val="both"/>
+              <w:rPr>
+                <w:rFonts w:ascii="Times New Roman" w:hAnsi="Times New Roman" w:cs="Times New Roman"/>
+                <w:b/>
+                <w:bCs/>
+                <w:sz w:val="18"/>
+                <w:szCs w:val="18"/>
+              </w:rPr>
+            </w:pPr>
+            <w:proofErr w:type="spellStart"/>
+            <w:r>
+              <w:rPr>
+                <w:rFonts w:ascii="Times New Roman" w:hAnsi="Times New Roman" w:cs="Times New Roman"/>
+                <w:b/>
+                <w:bCs/>
+                <w:sz w:val="18"/>
+                <w:szCs w:val="18"/>
+              </w:rPr>
+              <w:t>Preci</w:t>
+            </w:r>
+            <w:r>
+              <w:rPr>
+                <w:rFonts w:ascii="Times New Roman" w:hAnsi="Times New Roman" w:cs="Times New Roman"/>
+                <w:b/>
+                <w:bCs/>
+                <w:sz w:val="18"/>
+                <w:szCs w:val="18"/>
+              </w:rPr>
+              <w:t>-</w:t>
+            </w:r>
+            <w:r>
+              <w:rPr>
+                <w:rFonts w:ascii="Times New Roman" w:hAnsi="Times New Roman" w:cs="Times New Roman"/>
+                <w:b/>
+                <w:bCs/>
+                <w:sz w:val="18"/>
+                <w:szCs w:val="18"/>
+              </w:rPr>
+              <w:t>sion</w:t>
+            </w:r>
+            <w:proofErr w:type="spellEnd"/>
+          </w:p>
+        </w:tc>
+        <w:tc>
+          <w:tcPr>
+            <w:tcW w:w="689" w:type="dxa"/>
+          </w:tcPr>
+          <w:p>
+            <w:pPr>
+              <w:jc w:val="both"/>
+              <w:rPr>
+                <w:rFonts w:ascii="Times New Roman" w:hAnsi="Times New Roman" w:cs="Times New Roman"/>
+                <w:b/>
+                <w:bCs/>
+                <w:sz w:val="18"/>
+                <w:szCs w:val="18"/>
+              </w:rPr>
+            </w:pPr>
+            <w:r>
+              <w:rPr>
+                <w:rFonts w:ascii="Times New Roman" w:hAnsi="Times New Roman" w:cs="Times New Roman"/>
+                <w:b/>
+                <w:bCs/>
+                <w:sz w:val="18"/>
+                <w:szCs w:val="18"/>
+              </w:rPr>
+              <w:t>Recall</w:t>
+            </w:r>
+          </w:p>
+        </w:tc>
+        <w:tc>
+          <w:tcPr>
+            <w:tcW w:w="615" w:type="dxa"/>
+          </w:tcPr>
+          <w:p>
+            <w:pPr>
+              <w:jc w:val="both"/>
+              <w:rPr>
+                <w:rFonts w:ascii="Times New Roman" w:hAnsi="Times New Roman" w:cs="Times New Roman"/>
+                <w:b/>
+                <w:bCs/>
+                <w:sz w:val="18"/>
+                <w:szCs w:val="18"/>
+              </w:rPr>
+            </w:pPr>
+            <w:r>
+              <w:rPr>
+                <w:rFonts w:ascii="Times New Roman" w:hAnsi="Times New Roman" w:cs="Times New Roman"/>
+                <w:b/>
+                <w:bCs/>
+                <w:sz w:val="18"/>
+                <w:szCs w:val="18"/>
+              </w:rPr>
+              <w:t>F1</w:t>
+            </w:r>
+          </w:p>
+        </w:tc>
+      </w:tr>
+      <w:tr>
+        <w:trPr>
+          <w:trHeight w:val="539"/>
+        </w:trPr>
+        <w:tc>
+          <w:tcPr>
+            <w:tcW w:w="1290" w:type="dxa"/>
+          </w:tcPr>
+          <w:p>
+            <w:pPr>
+              <w:jc w:val="both"/>
+              <w:rPr>
+                <w:rFonts w:ascii="Times New Roman" w:hAnsi="Times New Roman" w:cs="Times New Roman"/>
+                <w:sz w:val="18"/>
+                <w:szCs w:val="18"/>
+              </w:rPr>
+            </w:pPr>
+            <w:proofErr w:type="spellStart"/>
+            <w:r>
+              <w:rPr>
+                <w:rFonts w:ascii="Times New Roman" w:hAnsi="Times New Roman" w:cs="Times New Roman"/>
+                <w:sz w:val="18"/>
+                <w:szCs w:val="18"/>
+              </w:rPr>
+              <w:t>RAGTruth</w:t>
+            </w:r>
+            <w:proofErr w:type="spellEnd"/>
+            <w:r>
+              <w:rPr>
+                <w:rFonts w:ascii="Times New Roman" w:hAnsi="Times New Roman" w:cs="Times New Roman"/>
+                <w:sz w:val="18"/>
+                <w:szCs w:val="18"/>
+              </w:rPr>
+              <w:t>-QA</w:t>
+            </w:r>
+            <w:r>
+              <w:rPr>
+                <w:rFonts w:ascii="Times New Roman" w:hAnsi="Times New Roman" w:cs="Times New Roman"/>
+                <w:sz w:val="18"/>
+                <w:szCs w:val="18"/>
+              </w:rPr>
+              <w:t xml:space="preserve"> </w:t>
+            </w:r>
+            <w:r>
+              <w:rPr>
+                <w:rFonts w:ascii="Times New Roman" w:hAnsi="Times New Roman" w:cs="Times New Roman"/>
+                <w:sz w:val="18"/>
+                <w:szCs w:val="18"/>
+              </w:rPr>
+              <w:t>test</w:t>
+            </w:r>
+          </w:p>
+        </w:tc>
+        <w:tc>
+          <w:tcPr>
+            <w:tcW w:w="708" w:type="dxa"/>
+          </w:tcPr>
+          <w:p>
+            <w:pPr>
+              <w:jc w:val="both"/>
+              <w:rPr>
+                <w:rFonts w:ascii="Times New Roman" w:hAnsi="Times New Roman" w:cs="Times New Roman"/>
+                <w:sz w:val="18"/>
+                <w:szCs w:val="18"/>
+              </w:rPr>
+            </w:pPr>
+            <w:r>
+              <w:rPr>
+                <w:rFonts w:ascii="Times New Roman" w:hAnsi="Times New Roman" w:cs="Times New Roman"/>
+                <w:sz w:val="18"/>
+                <w:szCs w:val="18"/>
+              </w:rPr>
+              <w:t>900</w:t>
+            </w:r>
+          </w:p>
+        </w:tc>
+        <w:tc>
+          <w:tcPr>
+            <w:tcW w:w="620" w:type="dxa"/>
+          </w:tcPr>
+          <w:p>
+            <w:pPr>
+              <w:jc w:val="both"/>
+              <w:rPr>
+                <w:rFonts w:ascii="Times New Roman" w:hAnsi="Times New Roman" w:cs="Times New Roman"/>
+                <w:sz w:val="18"/>
+                <w:szCs w:val="18"/>
+              </w:rPr>
+            </w:pPr>
+            <w:r>
+              <w:rPr>
+                <w:rFonts w:ascii="Times New Roman" w:hAnsi="Times New Roman" w:cs="Times New Roman"/>
+                <w:sz w:val="18"/>
+                <w:szCs w:val="18"/>
+              </w:rPr>
+              <w:t>0.480</w:t>
+            </w:r>
+          </w:p>
+        </w:tc>
+        <w:tc>
+          <w:tcPr>
+            <w:tcW w:w="916" w:type="dxa"/>
+          </w:tcPr>
+          <w:p>
+            <w:pPr>
+              <w:jc w:val="both"/>
+              <w:rPr>
+                <w:rFonts w:ascii="Times New Roman" w:hAnsi="Times New Roman" w:cs="Times New Roman"/>
+                <w:sz w:val="18"/>
+                <w:szCs w:val="18"/>
+              </w:rPr>
+            </w:pPr>
+            <w:r>
+              <w:rPr>
+                <w:rFonts w:ascii="Times New Roman" w:hAnsi="Times New Roman" w:cs="Times New Roman"/>
+                <w:sz w:val="18"/>
+                <w:szCs w:val="18"/>
+              </w:rPr>
+              <w:t>0.244</w:t>
+            </w:r>
+          </w:p>
+        </w:tc>
+        <w:tc>
+          <w:tcPr>
+            <w:tcW w:w="689" w:type="dxa"/>
+          </w:tcPr>
+          <w:p>
+            <w:pPr>
+              <w:jc w:val="both"/>
+              <w:rPr>
+                <w:rFonts w:ascii="Times New Roman" w:hAnsi="Times New Roman" w:cs="Times New Roman"/>
+                <w:sz w:val="18"/>
+                <w:szCs w:val="18"/>
+              </w:rPr>
+            </w:pPr>
+            <w:r>
+              <w:rPr>
+                <w:rFonts w:ascii="Times New Roman" w:hAnsi="Times New Roman" w:cs="Times New Roman"/>
+                <w:sz w:val="18"/>
+                <w:szCs w:val="18"/>
+              </w:rPr>
+              <w:t>0.919</w:t>
+            </w:r>
+          </w:p>
+        </w:tc>
+        <w:tc>
+          <w:tcPr>
+            <w:tcW w:w="615" w:type="dxa"/>
+          </w:tcPr>
+          <w:p>
+            <w:pPr>
+              <w:jc w:val="both"/>
+              <w:rPr>
+                <w:rFonts w:ascii="Times New Roman" w:hAnsi="Times New Roman" w:cs="Times New Roman"/>
+                <w:sz w:val="18"/>
+                <w:szCs w:val="18"/>
+              </w:rPr>
+            </w:pPr>
+            <w:r>
+              <w:rPr>
+                <w:rFonts w:ascii="Times New Roman" w:hAnsi="Times New Roman" w:cs="Times New Roman"/>
+                <w:sz w:val="18"/>
+                <w:szCs w:val="18"/>
+              </w:rPr>
+              <w:t>0.386</w:t>
+            </w:r>
+          </w:p>
+        </w:tc>
+      </w:tr>
+      <w:tr>
+        <w:trPr>
+          <w:trHeight w:val="557"/>
+        </w:trPr>
+        <w:tc>
+          <w:tcPr>
+            <w:tcW w:w="1290" w:type="dxa"/>
+          </w:tcPr>
+          <w:p>
+            <w:pPr>
+              <w:jc w:val="both"/>
+              <w:rPr>
+                <w:rFonts w:ascii="Times New Roman" w:hAnsi="Times New Roman" w:cs="Times New Roman"/>
+                <w:sz w:val="18"/>
+                <w:szCs w:val="18"/>
+              </w:rPr>
+            </w:pPr>
+            <w:r>
+              <w:rPr>
+                <w:rFonts w:ascii="Times New Roman" w:hAnsi="Times New Roman" w:cs="Times New Roman"/>
+                <w:sz w:val="18"/>
+                <w:szCs w:val="18"/>
+              </w:rPr>
+              <w:t>FinanceBench-50 (transfer)</w:t>
+            </w:r>
+          </w:p>
+        </w:tc>
+        <w:tc>
+          <w:tcPr>
+            <w:tcW w:w="708" w:type="dxa"/>
+          </w:tcPr>
+          <w:p>
+            <w:pPr>
+              <w:jc w:val="both"/>
+              <w:rPr>
+                <w:rFonts w:ascii="Times New Roman" w:hAnsi="Times New Roman" w:cs="Times New Roman"/>
+                <w:sz w:val="18"/>
+                <w:szCs w:val="18"/>
+              </w:rPr>
+            </w:pPr>
+            <w:r>
+              <w:rPr>
+                <w:rFonts w:ascii="Times New Roman" w:hAnsi="Times New Roman" w:cs="Times New Roman"/>
+                <w:sz w:val="18"/>
+                <w:szCs w:val="18"/>
+              </w:rPr>
+              <w:t>50</w:t>
+            </w:r>
+          </w:p>
+        </w:tc>
+        <w:tc>
+          <w:tcPr>
+            <w:tcW w:w="620" w:type="dxa"/>
+          </w:tcPr>
+          <w:p>
+            <w:pPr>
+              <w:jc w:val="both"/>
+              <w:rPr>
+                <w:rFonts w:ascii="Times New Roman" w:hAnsi="Times New Roman" w:cs="Times New Roman"/>
+                <w:sz w:val="18"/>
+                <w:szCs w:val="18"/>
+              </w:rPr>
+            </w:pPr>
+            <w:r>
+              <w:rPr>
+                <w:rFonts w:ascii="Times New Roman" w:hAnsi="Times New Roman" w:cs="Times New Roman"/>
+                <w:sz w:val="18"/>
+                <w:szCs w:val="18"/>
+              </w:rPr>
+              <w:t>0.680</w:t>
+            </w:r>
+          </w:p>
+        </w:tc>
+        <w:tc>
+          <w:tcPr>
+            <w:tcW w:w="916" w:type="dxa"/>
+          </w:tcPr>
+          <w:p>
+            <w:pPr>
+              <w:jc w:val="both"/>
+              <w:rPr>
+                <w:rFonts w:ascii="Times New Roman" w:hAnsi="Times New Roman" w:cs="Times New Roman"/>
+                <w:sz w:val="18"/>
+                <w:szCs w:val="18"/>
+              </w:rPr>
+            </w:pPr>
+            <w:r>
+              <w:rPr>
+                <w:rFonts w:ascii="Times New Roman" w:hAnsi="Times New Roman" w:cs="Times New Roman"/>
+                <w:sz w:val="18"/>
+                <w:szCs w:val="18"/>
+              </w:rPr>
+              <w:t>0.767</w:t>
+            </w:r>
+          </w:p>
+        </w:tc>
+        <w:tc>
+          <w:tcPr>
+            <w:tcW w:w="689" w:type="dxa"/>
+          </w:tcPr>
+          <w:p>
+            <w:pPr>
+              <w:jc w:val="both"/>
+              <w:rPr>
+                <w:rFonts w:ascii="Times New Roman" w:hAnsi="Times New Roman" w:cs="Times New Roman"/>
+                <w:sz w:val="18"/>
+                <w:szCs w:val="18"/>
+              </w:rPr>
+            </w:pPr>
+            <w:r>
+              <w:rPr>
+                <w:rFonts w:ascii="Times New Roman" w:hAnsi="Times New Roman" w:cs="Times New Roman"/>
+                <w:sz w:val="18"/>
+                <w:szCs w:val="18"/>
+              </w:rPr>
+              <w:t>0.846</w:t>
+            </w:r>
+          </w:p>
+        </w:tc>
+        <w:tc>
+          <w:tcPr>
+            <w:tcW w:w="615" w:type="dxa"/>
+          </w:tcPr>
+          <w:p>
+            <w:pPr>
+              <w:jc w:val="both"/>
+              <w:rPr>
+                <w:rFonts w:ascii="Times New Roman" w:hAnsi="Times New Roman" w:cs="Times New Roman"/>
+                <w:sz w:val="18"/>
+                <w:szCs w:val="18"/>
+              </w:rPr>
+            </w:pPr>
+            <w:r>
+              <w:rPr>
+                <w:rFonts w:ascii="Times New Roman" w:hAnsi="Times New Roman" w:cs="Times New Roman"/>
+                <w:sz w:val="18"/>
+                <w:szCs w:val="18"/>
+              </w:rPr>
+              <w:t>0.805</w:t>
+            </w:r>
+          </w:p>
+        </w:tc>
+      </w:tr>
+    </w:tbl>
+    <w:p>
+      <w:pPr>
+        <w:jc w:val="both"/>
+        <w:rPr>
+          <w:rFonts w:ascii="Times New Roman" w:hAnsi="Times New Roman" w:cs="Times New Roman"/>
+        </w:rPr>
+      </w:pPr>
+    </w:p>
+    <w:p>
+      <w:pPr>
         <w:pStyle w:val="Heading1"/>
         <w:rPr>
           <w:rFonts w:ascii="Times New Roman" w:hAnsi="Times New Roman" w:cs="Times New Roman"/>
@@ -5988,6 +6848,7 @@
         <w:rPr>
           <w:rFonts w:ascii="Times New Roman" w:hAnsi="Times New Roman" w:cs="Times New Roman"/>
         </w:rPr>
+        <w:lastRenderedPageBreak/>
         <w:t>Conclusion, Limitations, and Future Work</w:t>
       </w:r>
     </w:p>
@@ -6136,14 +6997,7 @@
         <w:rPr>
           <w:rFonts w:ascii="Times New Roman" w:hAnsi="Times New Roman" w:cs="Times New Roman"/>
         </w:rPr>
-        <w:t xml:space="preserve"> RAGAS faithfulness relies </w:t>
-      </w:r>
-      <w:r>
-        <w:rPr>
-          <w:rFonts w:ascii="Times New Roman" w:hAnsi="Times New Roman" w:cs="Times New Roman"/>
-        </w:rPr>
-        <w:lastRenderedPageBreak/>
-        <w:t>on an LLM judge (GPT-4o-mini); absolute values should be read comparatively.</w:t>
+        <w:t xml:space="preserve"> RAGAS faithfulness relies on an LLM judge (GPT-4o-mini); absolute values should be read comparatively.</w:t>
       </w:r>
     </w:p>
     <w:p>
@@ -6183,8 +7037,8 @@
           <w:rFonts w:ascii="Times New Roman" w:hAnsi="Times New Roman" w:cs="Times New Roman"/>
         </w:rPr>
       </w:pPr>
-      <w:bookmarkStart w:id="10" w:name="references"/>
-      <w:bookmarkEnd w:id="9"/>
+      <w:bookmarkStart w:id="11" w:name="references"/>
+      <w:bookmarkEnd w:id="10"/>
       <w:r>
         <w:rPr>
           <w:rFonts w:ascii="Times New Roman" w:hAnsi="Times New Roman" w:cs="Times New Roman"/>
@@ -6199,8 +7053,8 @@
           <w:rFonts w:ascii="Times New Roman" w:hAnsi="Times New Roman" w:cs="Times New Roman"/>
         </w:rPr>
       </w:pPr>
-      <w:bookmarkStart w:id="11" w:name="ref-asai2024selfrag"/>
-      <w:bookmarkStart w:id="12" w:name="refs"/>
+      <w:bookmarkStart w:id="12" w:name="ref-asai2024selfrag"/>
+      <w:bookmarkStart w:id="13" w:name="refs"/>
       <w:r>
         <w:rPr>
           <w:rFonts w:ascii="Times New Roman" w:hAnsi="Times New Roman" w:cs="Times New Roman"/>
@@ -6229,13 +7083,19 @@
           <w:rFonts w:ascii="Times New Roman" w:hAnsi="Times New Roman" w:cs="Times New Roman"/>
         </w:rPr>
       </w:pPr>
-      <w:bookmarkStart w:id="13" w:name="ref-chen2024rgb"/>
-      <w:bookmarkEnd w:id="11"/>
-      <w:r>
-        <w:rPr>
-          <w:rFonts w:ascii="Times New Roman" w:hAnsi="Times New Roman" w:cs="Times New Roman"/>
-        </w:rPr>
-        <w:t xml:space="preserve">Chen, Jiawei, Hongyu Lin, Xianpei Han, and Le Sun. 2024. “Benchmarking Large Language Models in Retrieval-Augmented Generation.” In </w:t>
+      <w:bookmarkStart w:id="14" w:name="ref-chen2024rgb"/>
+      <w:bookmarkEnd w:id="12"/>
+      <w:r>
+        <w:rPr>
+          <w:rFonts w:ascii="Times New Roman" w:hAnsi="Times New Roman" w:cs="Times New Roman"/>
+        </w:rPr>
+        <w:t xml:space="preserve">Chen, Jiawei, Hongyu Lin, Xianpei Han, and Le Sun. 2024. “Benchmarking Large Language Models </w:t>
+      </w:r>
+      <w:r>
+        <w:rPr>
+          <w:rFonts w:ascii="Times New Roman" w:hAnsi="Times New Roman" w:cs="Times New Roman"/>
+        </w:rPr>
+        <w:t xml:space="preserve">in Retrieval-Augmented Generation.” In </w:t>
       </w:r>
       <w:r>
         <w:rPr>
@@ -6259,8 +7119,8 @@
           <w:rFonts w:ascii="Times New Roman" w:hAnsi="Times New Roman" w:cs="Times New Roman"/>
         </w:rPr>
       </w:pPr>
-      <w:bookmarkStart w:id="14" w:name="ref-chen2021finqa"/>
-      <w:bookmarkEnd w:id="13"/>
+      <w:bookmarkStart w:id="15" w:name="ref-chen2021finqa"/>
+      <w:bookmarkEnd w:id="14"/>
       <w:r>
         <w:rPr>
           <w:rFonts w:ascii="Times New Roman" w:hAnsi="Times New Roman" w:cs="Times New Roman"/>
@@ -6289,8 +7149,8 @@
           <w:rFonts w:ascii="Times New Roman" w:hAnsi="Times New Roman" w:cs="Times New Roman"/>
         </w:rPr>
       </w:pPr>
-      <w:bookmarkStart w:id="15" w:name="ref-chen2022convfinqa"/>
-      <w:bookmarkEnd w:id="14"/>
+      <w:bookmarkStart w:id="16" w:name="ref-chen2022convfinqa"/>
+      <w:bookmarkEnd w:id="15"/>
       <w:r>
         <w:rPr>
           <w:rFonts w:ascii="Times New Roman" w:hAnsi="Times New Roman" w:cs="Times New Roman"/>
@@ -6319,8 +7179,8 @@
           <w:rFonts w:ascii="Times New Roman" w:hAnsi="Times New Roman" w:cs="Times New Roman"/>
         </w:rPr>
       </w:pPr>
-      <w:bookmarkStart w:id="16" w:name="ref-es2024ragas"/>
-      <w:bookmarkEnd w:id="15"/>
+      <w:bookmarkStart w:id="17" w:name="ref-es2024ragas"/>
+      <w:bookmarkEnd w:id="16"/>
       <w:r>
         <w:rPr>
           <w:rFonts w:ascii="Times New Roman" w:hAnsi="Times New Roman" w:cs="Times New Roman"/>
@@ -6349,8 +7209,8 @@
           <w:rFonts w:ascii="Times New Roman" w:hAnsi="Times New Roman" w:cs="Times New Roman"/>
         </w:rPr>
       </w:pPr>
-      <w:bookmarkStart w:id="17" w:name="ref-friel2024ragbench"/>
-      <w:bookmarkEnd w:id="16"/>
+      <w:bookmarkStart w:id="18" w:name="ref-friel2024ragbench"/>
+      <w:bookmarkEnd w:id="17"/>
       <w:r>
         <w:rPr>
           <w:rFonts w:ascii="Times New Roman" w:hAnsi="Times New Roman" w:cs="Times New Roman"/>
@@ -6379,8 +7239,8 @@
           <w:rFonts w:ascii="Times New Roman" w:hAnsi="Times New Roman" w:cs="Times New Roman"/>
         </w:rPr>
       </w:pPr>
-      <w:bookmarkStart w:id="18" w:name="ref-gao2023ragsurvey"/>
-      <w:bookmarkEnd w:id="17"/>
+      <w:bookmarkStart w:id="19" w:name="ref-gao2023ragsurvey"/>
+      <w:bookmarkEnd w:id="18"/>
       <w:r>
         <w:rPr>
           <w:rFonts w:ascii="Times New Roman" w:hAnsi="Times New Roman" w:cs="Times New Roman"/>
@@ -6409,19 +7269,13 @@
           <w:rFonts w:ascii="Times New Roman" w:hAnsi="Times New Roman" w:cs="Times New Roman"/>
         </w:rPr>
       </w:pPr>
-      <w:bookmarkStart w:id="19" w:name="ref-guu2020realm"/>
-      <w:bookmarkEnd w:id="18"/>
-      <w:r>
-        <w:rPr>
-          <w:rFonts w:ascii="Times New Roman" w:hAnsi="Times New Roman" w:cs="Times New Roman"/>
-        </w:rPr>
-        <w:t xml:space="preserve">Guu, Kelvin, Kenton Lee, Zora Tung, Panupong Pasupat, and Ming-Wei Chang. 2020. “REALM: </w:t>
-      </w:r>
-      <w:r>
-        <w:rPr>
-          <w:rFonts w:ascii="Times New Roman" w:hAnsi="Times New Roman" w:cs="Times New Roman"/>
-        </w:rPr>
-        <w:t xml:space="preserve">Retrieval-Augmented Language Model Pre-Training.” In </w:t>
+      <w:bookmarkStart w:id="20" w:name="ref-guu2020realm"/>
+      <w:bookmarkEnd w:id="19"/>
+      <w:r>
+        <w:rPr>
+          <w:rFonts w:ascii="Times New Roman" w:hAnsi="Times New Roman" w:cs="Times New Roman"/>
+        </w:rPr>
+        <w:t xml:space="preserve">Guu, Kelvin, Kenton Lee, Zora Tung, Panupong Pasupat, and Ming-Wei Chang. 2020. “REALM: Retrieval-Augmented Language Model Pre-Training.” In </w:t>
       </w:r>
       <w:r>
         <w:rPr>
@@ -6445,8 +7299,8 @@
           <w:rFonts w:ascii="Times New Roman" w:hAnsi="Times New Roman" w:cs="Times New Roman"/>
         </w:rPr>
       </w:pPr>
-      <w:bookmarkStart w:id="20" w:name="ref-huang2023hallucinationsurvey"/>
-      <w:bookmarkEnd w:id="19"/>
+      <w:bookmarkStart w:id="21" w:name="ref-huang2023hallucinationsurvey"/>
+      <w:bookmarkEnd w:id="20"/>
       <w:r>
         <w:rPr>
           <w:rFonts w:ascii="Times New Roman" w:hAnsi="Times New Roman" w:cs="Times New Roman"/>
@@ -6475,8 +7329,8 @@
           <w:rFonts w:ascii="Times New Roman" w:hAnsi="Times New Roman" w:cs="Times New Roman"/>
         </w:rPr>
       </w:pPr>
-      <w:bookmarkStart w:id="21" w:name="ref-islam2023financebench"/>
-      <w:bookmarkEnd w:id="20"/>
+      <w:bookmarkStart w:id="22" w:name="ref-islam2023financebench"/>
+      <w:bookmarkEnd w:id="21"/>
       <w:r>
         <w:rPr>
           <w:rFonts w:ascii="Times New Roman" w:hAnsi="Times New Roman" w:cs="Times New Roman"/>
@@ -6505,8 +7359,8 @@
           <w:rFonts w:ascii="Times New Roman" w:hAnsi="Times New Roman" w:cs="Times New Roman"/>
         </w:rPr>
       </w:pPr>
-      <w:bookmarkStart w:id="22" w:name="ref-izacard2021fid"/>
-      <w:bookmarkEnd w:id="21"/>
+      <w:bookmarkStart w:id="23" w:name="ref-izacard2021fid"/>
+      <w:bookmarkEnd w:id="22"/>
       <w:r>
         <w:rPr>
           <w:rFonts w:ascii="Times New Roman" w:hAnsi="Times New Roman" w:cs="Times New Roman"/>
@@ -6535,13 +7389,20 @@
           <w:rFonts w:ascii="Times New Roman" w:hAnsi="Times New Roman" w:cs="Times New Roman"/>
         </w:rPr>
       </w:pPr>
-      <w:bookmarkStart w:id="23" w:name="ref-ji2023hallucination"/>
-      <w:bookmarkEnd w:id="22"/>
-      <w:r>
-        <w:rPr>
-          <w:rFonts w:ascii="Times New Roman" w:hAnsi="Times New Roman" w:cs="Times New Roman"/>
-        </w:rPr>
-        <w:t xml:space="preserve">Ji, Ziwei, Nayeon Lee, Rita Frieske, Tiezheng Yu, Dan Su, Yan Xu, Etsuko Ishii, Ye Jin Bang, Andrea Madotto, and Pascale Fung. 2023. “Survey of Hallucination in Natural Language Generation.” </w:t>
+      <w:bookmarkStart w:id="24" w:name="ref-ji2023hallucination"/>
+      <w:bookmarkEnd w:id="23"/>
+      <w:r>
+        <w:rPr>
+          <w:rFonts w:ascii="Times New Roman" w:hAnsi="Times New Roman" w:cs="Times New Roman"/>
+        </w:rPr>
+        <w:t xml:space="preserve">Ji, Ziwei, Nayeon Lee, Rita Frieske, Tiezheng Yu, Dan Su, Yan Xu, Etsuko Ishii, Ye Jin Bang, Andrea Madotto, and Pascale Fung. 2023. “Survey of </w:t>
+      </w:r>
+      <w:r>
+        <w:rPr>
+          <w:rFonts w:ascii="Times New Roman" w:hAnsi="Times New Roman" w:cs="Times New Roman"/>
+        </w:rPr>
+        <w:lastRenderedPageBreak/>
+        <w:t xml:space="preserve">Hallucination in Natural Language Generation.” </w:t>
       </w:r>
       <w:r>
         <w:rPr>
@@ -6565,8 +7426,8 @@
           <w:rFonts w:ascii="Times New Roman" w:hAnsi="Times New Roman" w:cs="Times New Roman"/>
         </w:rPr>
       </w:pPr>
-      <w:bookmarkStart w:id="24" w:name="ref-jiang2023mistral"/>
-      <w:bookmarkEnd w:id="23"/>
+      <w:bookmarkStart w:id="25" w:name="ref-jiang2023mistral"/>
+      <w:bookmarkEnd w:id="24"/>
       <w:r>
         <w:rPr>
           <w:rFonts w:ascii="Times New Roman" w:hAnsi="Times New Roman" w:cs="Times New Roman"/>
@@ -6595,8 +7456,8 @@
           <w:rFonts w:ascii="Times New Roman" w:hAnsi="Times New Roman" w:cs="Times New Roman"/>
         </w:rPr>
       </w:pPr>
-      <w:bookmarkStart w:id="25" w:name="ref-karpukhin2020dpr"/>
-      <w:bookmarkEnd w:id="24"/>
+      <w:bookmarkStart w:id="26" w:name="ref-karpukhin2020dpr"/>
+      <w:bookmarkEnd w:id="25"/>
       <w:r>
         <w:rPr>
           <w:rFonts w:ascii="Times New Roman" w:hAnsi="Times New Roman" w:cs="Times New Roman"/>
@@ -6625,8 +7486,8 @@
           <w:rFonts w:ascii="Times New Roman" w:hAnsi="Times New Roman" w:cs="Times New Roman"/>
         </w:rPr>
       </w:pPr>
-      <w:bookmarkStart w:id="26" w:name="ref-lewis2020rag"/>
-      <w:bookmarkEnd w:id="25"/>
+      <w:bookmarkStart w:id="27" w:name="ref-lewis2020rag"/>
+      <w:bookmarkEnd w:id="26"/>
       <w:r>
         <w:rPr>
           <w:rFonts w:ascii="Times New Roman" w:hAnsi="Times New Roman" w:cs="Times New Roman"/>
@@ -6655,8 +7516,8 @@
           <w:rFonts w:ascii="Times New Roman" w:hAnsi="Times New Roman" w:cs="Times New Roman"/>
         </w:rPr>
       </w:pPr>
-      <w:bookmarkStart w:id="27" w:name="ref-ma2023queryrewriting"/>
-      <w:bookmarkEnd w:id="26"/>
+      <w:bookmarkStart w:id="28" w:name="ref-ma2023queryrewriting"/>
+      <w:bookmarkEnd w:id="27"/>
       <w:r>
         <w:rPr>
           <w:rFonts w:ascii="Times New Roman" w:hAnsi="Times New Roman" w:cs="Times New Roman"/>
@@ -6685,8 +7546,8 @@
           <w:rFonts w:ascii="Times New Roman" w:hAnsi="Times New Roman" w:cs="Times New Roman"/>
         </w:rPr>
       </w:pPr>
-      <w:bookmarkStart w:id="28" w:name="ref-manakul2023selfcheckgpt"/>
-      <w:bookmarkEnd w:id="27"/>
+      <w:bookmarkStart w:id="29" w:name="ref-manakul2023selfcheckgpt"/>
+      <w:bookmarkEnd w:id="28"/>
       <w:r>
         <w:rPr>
           <w:rFonts w:ascii="Times New Roman" w:hAnsi="Times New Roman" w:cs="Times New Roman"/>
@@ -6715,13 +7576,12 @@
           <w:rFonts w:ascii="Times New Roman" w:hAnsi="Times New Roman" w:cs="Times New Roman"/>
         </w:rPr>
       </w:pPr>
-      <w:bookmarkStart w:id="29" w:name="ref-min2023factscore"/>
-      <w:bookmarkEnd w:id="28"/>
-      <w:r>
-        <w:rPr>
-          <w:rFonts w:ascii="Times New Roman" w:hAnsi="Times New Roman" w:cs="Times New Roman"/>
-        </w:rPr>
-        <w:lastRenderedPageBreak/>
+      <w:bookmarkStart w:id="30" w:name="ref-min2023factscore"/>
+      <w:bookmarkEnd w:id="29"/>
+      <w:r>
+        <w:rPr>
+          <w:rFonts w:ascii="Times New Roman" w:hAnsi="Times New Roman" w:cs="Times New Roman"/>
+        </w:rPr>
         <w:t xml:space="preserve">Min, Sewon, Kalpesh Krishna, Xinxi Lyu, Mike Lewis, Wen-tau Yih, Pang Wei Koh, Mohit Iyyer, Luke Zettlemoyer, and Hannaneh Hajishirzi. 2023. “FActScore: Fine-Grained Atomic Evaluation of Factual Precision in Long Form Text Generation.” In </w:t>
       </w:r>
       <w:r>
@@ -6746,8 +7606,8 @@
           <w:rFonts w:ascii="Times New Roman" w:hAnsi="Times New Roman" w:cs="Times New Roman"/>
         </w:rPr>
       </w:pPr>
-      <w:bookmarkStart w:id="30" w:name="ref-niu2024ragtruth"/>
-      <w:bookmarkEnd w:id="29"/>
+      <w:bookmarkStart w:id="31" w:name="ref-niu2024ragtruth"/>
+      <w:bookmarkEnd w:id="30"/>
       <w:r>
         <w:rPr>
           <w:rFonts w:ascii="Times New Roman" w:hAnsi="Times New Roman" w:cs="Times New Roman"/>
@@ -6776,8 +7636,8 @@
           <w:rFonts w:ascii="Times New Roman" w:hAnsi="Times New Roman" w:cs="Times New Roman"/>
         </w:rPr>
       </w:pPr>
-      <w:bookmarkStart w:id="31" w:name="ref-rajpurkar2016squad"/>
-      <w:bookmarkEnd w:id="30"/>
+      <w:bookmarkStart w:id="32" w:name="ref-rajpurkar2016squad"/>
+      <w:bookmarkEnd w:id="31"/>
       <w:r>
         <w:rPr>
           <w:rFonts w:ascii="Times New Roman" w:hAnsi="Times New Roman" w:cs="Times New Roman"/>
@@ -6806,8 +7666,8 @@
           <w:rFonts w:ascii="Times New Roman" w:hAnsi="Times New Roman" w:cs="Times New Roman"/>
         </w:rPr>
       </w:pPr>
-      <w:bookmarkStart w:id="32" w:name="ref-reimers2019sbert"/>
-      <w:bookmarkEnd w:id="31"/>
+      <w:bookmarkStart w:id="33" w:name="ref-reimers2019sbert"/>
+      <w:bookmarkEnd w:id="32"/>
       <w:r>
         <w:rPr>
           <w:rFonts w:ascii="Times New Roman" w:hAnsi="Times New Roman" w:cs="Times New Roman"/>
@@ -6836,8 +7696,8 @@
           <w:rFonts w:ascii="Times New Roman" w:hAnsi="Times New Roman" w:cs="Times New Roman"/>
         </w:rPr>
       </w:pPr>
-      <w:bookmarkStart w:id="33" w:name="ref-robertson2009bm25"/>
-      <w:bookmarkEnd w:id="32"/>
+      <w:bookmarkStart w:id="34" w:name="ref-robertson2009bm25"/>
+      <w:bookmarkEnd w:id="33"/>
       <w:r>
         <w:rPr>
           <w:rFonts w:ascii="Times New Roman" w:hAnsi="Times New Roman" w:cs="Times New Roman"/>
@@ -6866,8 +7726,8 @@
           <w:rFonts w:ascii="Times New Roman" w:hAnsi="Times New Roman" w:cs="Times New Roman"/>
         </w:rPr>
       </w:pPr>
-      <w:bookmarkStart w:id="34" w:name="ref-wu2023bloomberggpt"/>
-      <w:bookmarkEnd w:id="33"/>
+      <w:bookmarkStart w:id="35" w:name="ref-wu2023bloomberggpt"/>
+      <w:bookmarkEnd w:id="34"/>
       <w:r>
         <w:rPr>
           <w:rFonts w:ascii="Times New Roman" w:hAnsi="Times New Roman" w:cs="Times New Roman"/>
@@ -6896,8 +7756,8 @@
           <w:rFonts w:ascii="Times New Roman" w:hAnsi="Times New Roman" w:cs="Times New Roman"/>
         </w:rPr>
       </w:pPr>
-      <w:bookmarkStart w:id="35" w:name="ref-yang2023fingpt"/>
-      <w:bookmarkEnd w:id="34"/>
+      <w:bookmarkStart w:id="36" w:name="ref-yang2023fingpt"/>
+      <w:bookmarkEnd w:id="35"/>
       <w:r>
         <w:rPr>
           <w:rFonts w:ascii="Times New Roman" w:hAnsi="Times New Roman" w:cs="Times New Roman"/>
@@ -6926,8 +7786,8 @@
           <w:rFonts w:ascii="Times New Roman" w:hAnsi="Times New Roman" w:cs="Times New Roman"/>
         </w:rPr>
       </w:pPr>
-      <w:bookmarkStart w:id="36" w:name="ref-zhu2021tatqa"/>
-      <w:bookmarkEnd w:id="35"/>
+      <w:bookmarkStart w:id="37" w:name="ref-zhu2021tatqa"/>
+      <w:bookmarkEnd w:id="36"/>
       <w:r>
         <w:rPr>
           <w:rFonts w:ascii="Times New Roman" w:hAnsi="Times New Roman" w:cs="Times New Roman"/>
@@ -6949,9 +7809,9 @@
         <w:t>.</w:t>
       </w:r>
     </w:p>
-    <w:bookmarkEnd w:id="10"/>
-    <w:bookmarkEnd w:id="12"/>
-    <w:bookmarkEnd w:id="36"/>
+    <w:bookmarkEnd w:id="11"/>
+    <w:bookmarkEnd w:id="13"/>
+    <w:bookmarkEnd w:id="37"/>
     <w:p>
       <w:pPr>
         <w:rPr>

</xml_diff>

<commit_message>
Paper: chunk-size ablation result, scope note, Table 5, heading fix
Reconcile the report with the proposal and add the new experiment:
- Results: add a chunk-size paragraph (256 vs 512, Dense) — 512 wins on retrieval
  recall, coverage, context precision, F1 and numeric-EM; 256's only edge is a
  marginally higher (tighter-context) faithfulness. Closes the proposal's chunk-size
  hyperparameter as a delivered result.
- Limitations: add a "Scope note" framing the controlled comparisons (retrieval fixed
  vs generator fixed) instead of a full pipeline×generator matrix, and disclosing that
  the RoBERTa detector is binary (not the proposed multi-class categorizer).
- Remove the orphaned empty heading before "Toward automatic detection".
- main.md: mirror the above + add the Table 5 (classifier) block and its reference.

docx edits applied surgically to preserve the manual formatting; docx and main.md kept
consistent (5 tables).
</commit_message>
<xml_diff>
--- a/paper/main.docx
+++ b/paper/main.docx
@@ -3710,6 +3710,28 @@
     </w:p>
     <w:p>
       <w:pPr>
+        <w:jc w:val="both"/>
+        <w:rPr>
+          <w:rFonts w:ascii="Times New Roman" w:hAnsi="Times New Roman" w:cs="Times New Roman"/>
+        </w:rPr>
+      </w:pPr>
+      <w:r>
+        <w:rPr>
+          <w:rFonts w:ascii="Times New Roman" w:hAnsi="Times New Roman" w:cs="Times New Roman"/>
+          <w:b/>
+          <w:bCs/>
+        </w:rPr>
+        <w:t xml:space="preserve">Chunk size.</w:t>
+      </w:r>
+      <w:r>
+        <w:rPr>
+          <w:rFonts w:ascii="Times New Roman" w:hAnsi="Times New Roman" w:cs="Times New Roman"/>
+        </w:rPr>
+        <w:t xml:space="preserve"> We also varied chunk size on the Dense pipeline (256 vs. 512 tokens, top-3, all else fixed). Smaller 256-token chunks fragment a figure from its surrounding label and hurt where it matters: the correct filing is retrieved less often (Retr@3 59% vs. 64%), fewer questions are answered (70 vs. 82 of 150), and context precision, answer relevancy, F1 and numeric-tolerant EM all fall. Their only edge is a marginally higher faithfulness score (0.23 vs. 0.20), an artifact of committing less to a tighter context. We therefore use 512-token chunks throughout.</w:t>
+      </w:r>
+    </w:p>
+    <w:p>
+      <w:pPr>
         <w:pStyle w:val="Heading2"/>
         <w:rPr>
           <w:rFonts w:ascii="Times New Roman" w:hAnsi="Times New Roman" w:cs="Times New Roman"/>
@@ -6158,23 +6180,6 @@
     </w:tbl>
     <w:p>
       <w:pPr>
-        <w:pStyle w:val="Heading1"/>
-        <w:numPr>
-          <w:ilvl w:val="0"/>
-          <w:numId w:val="0"/>
-        </w:numPr>
-        <w:ind w:left="397"/>
-        <w:rPr>
-          <w:rFonts w:ascii="Times New Roman" w:hAnsi="Times New Roman" w:cs="Times New Roman"/>
-          <w:sz w:val="22"/>
-          <w:szCs w:val="22"/>
-        </w:rPr>
-      </w:pPr>
-      <w:bookmarkStart w:id="10" w:name="conclusion-limitations-and-future-work"/>
-      <w:bookmarkEnd w:id="9"/>
-    </w:p>
-    <w:p>
-      <w:pPr>
         <w:jc w:val="both"/>
         <w:rPr>
           <w:rFonts w:ascii="Times New Roman" w:hAnsi="Times New Roman" w:cs="Times New Roman"/>
@@ -6998,6 +7003,28 @@
           <w:rFonts w:ascii="Times New Roman" w:hAnsi="Times New Roman" w:cs="Times New Roman"/>
         </w:rPr>
         <w:t xml:space="preserve"> RAGAS faithfulness relies on an LLM judge (GPT-4o-mini); absolute values should be read comparatively.</w:t>
+      </w:r>
+    </w:p>
+    <w:p>
+      <w:pPr>
+        <w:jc w:val="both"/>
+        <w:rPr>
+          <w:rFonts w:ascii="Times New Roman" w:hAnsi="Times New Roman" w:cs="Times New Roman"/>
+        </w:rPr>
+      </w:pPr>
+      <w:r>
+        <w:rPr>
+          <w:rFonts w:ascii="Times New Roman" w:hAnsi="Times New Roman" w:cs="Times New Roman"/>
+          <w:b/>
+          <w:bCs/>
+        </w:rPr>
+        <w:t xml:space="preserve">Scope note.</w:t>
+      </w:r>
+      <w:r>
+        <w:rPr>
+          <w:rFonts w:ascii="Times New Roman" w:hAnsi="Times New Roman" w:cs="Times New Roman"/>
+        </w:rPr>
+        <w:t xml:space="preserve"> We report retrieval and generator effects as separate controlled comparisons — varying only retrieval with the generator fixed (Tables 1–2) and only the generator on identical retrieved context (Table 3) — rather than a single pipeline×generator matrix, which isolates each factor instead of confounding them. One planned component was narrowed in scope: the RoBERTa detector (Table 5) was built as a binary hallucinated-vs-grounded classifier rather than a multi-class categorizer of the four hallucination types; multi-class categorization remains future work.</w:t>
       </w:r>
     </w:p>
     <w:p>

</xml_diff>